<commit_message>
Adding archive, updating organization readme
</commit_message>
<xml_diff>
--- a/OrganizationREADME.docx
+++ b/OrganizationREADME.docx
@@ -134,34 +134,22 @@
                 <w:bCs/>
               </w:rPr>
             </w:pPr>
-          </w:p>
-          <w:p>
-            <w:pPr>
-              <w:rPr>
-                <w:rFonts w:ascii="Times New Roman" w:hAnsi="Times New Roman" w:cs="Times New Roman"/>
-                <w:b/>
-                <w:bCs/>
-              </w:rPr>
-            </w:pPr>
-          </w:p>
-          <w:p>
-            <w:pPr>
-              <w:rPr>
-                <w:rFonts w:ascii="Times New Roman" w:hAnsi="Times New Roman" w:cs="Times New Roman"/>
-                <w:b/>
-                <w:bCs/>
-              </w:rPr>
-            </w:pPr>
-            <w:proofErr w:type="spellStart"/>
-            <w:r>
-              <w:rPr>
-                <w:rFonts w:ascii="Times New Roman" w:hAnsi="Times New Roman" w:cs="Times New Roman"/>
-                <w:b/>
-                <w:bCs/>
-              </w:rPr>
-              <w:t>useme_lca</w:t>
-            </w:r>
-            <w:proofErr w:type="spellEnd"/>
+            <w:r>
+              <w:rPr>
+                <w:rFonts w:ascii="Times New Roman" w:hAnsi="Times New Roman" w:cs="Times New Roman"/>
+                <w:b/>
+                <w:bCs/>
+              </w:rPr>
+              <w:t>useme_</w:t>
+            </w:r>
+            <w:r>
+              <w:rPr>
+                <w:rFonts w:ascii="Times New Roman" w:hAnsi="Times New Roman" w:cs="Times New Roman"/>
+                <w:b/>
+                <w:bCs/>
+              </w:rPr>
+              <w:t>data_cleaning</w:t>
+            </w:r>
           </w:p>
         </w:tc>
         <w:tc>
@@ -196,27 +184,7 @@
               <w:rPr>
                 <w:rFonts w:ascii="Times New Roman" w:hAnsi="Times New Roman" w:cs="Times New Roman"/>
               </w:rPr>
-              <w:t xml:space="preserve">raw data after initial cleaning; </w:t>
-            </w:r>
-            <w:r>
-              <w:rPr>
-                <w:rFonts w:ascii="Times New Roman" w:hAnsi="Times New Roman" w:cs="Times New Roman"/>
-              </w:rPr>
-              <w:t xml:space="preserve">separate </w:t>
-            </w:r>
-            <w:proofErr w:type="spellStart"/>
-            <w:r>
-              <w:rPr>
-                <w:rFonts w:ascii="Times New Roman" w:hAnsi="Times New Roman" w:cs="Times New Roman"/>
-              </w:rPr>
-              <w:t>dataframe</w:t>
-            </w:r>
-            <w:proofErr w:type="spellEnd"/>
-            <w:r>
-              <w:rPr>
-                <w:rFonts w:ascii="Times New Roman" w:hAnsi="Times New Roman" w:cs="Times New Roman"/>
-              </w:rPr>
-              <w:t xml:space="preserve"> for e-cig and smokeless.</w:t>
+              <w:t>MD File with information for downloading the public use PATH data used for this paper</w:t>
             </w:r>
           </w:p>
         </w:tc>
@@ -247,67 +215,35 @@
                 <w:rFonts w:ascii="Times New Roman" w:hAnsi="Times New Roman" w:cs="Times New Roman"/>
               </w:rPr>
             </w:pPr>
-            <w:proofErr w:type="spellStart"/>
-            <w:r>
-              <w:rPr>
-                <w:rFonts w:ascii="Times New Roman" w:hAnsi="Times New Roman" w:cs="Times New Roman"/>
-              </w:rPr>
-              <w:t>mplus_lca_ecig</w:t>
-            </w:r>
-            <w:proofErr w:type="spellEnd"/>
-          </w:p>
-        </w:tc>
-        <w:tc>
-          <w:tcPr>
-            <w:tcW w:w="3117" w:type="dxa"/>
-          </w:tcPr>
-          <w:p>
-            <w:pPr>
-              <w:rPr>
-                <w:rFonts w:ascii="Times New Roman" w:hAnsi="Times New Roman" w:cs="Times New Roman"/>
-              </w:rPr>
-            </w:pPr>
-            <w:r>
-              <w:rPr>
-                <w:rFonts w:ascii="Times New Roman" w:hAnsi="Times New Roman" w:cs="Times New Roman"/>
-                <w:b/>
-                <w:bCs/>
-              </w:rPr>
-              <w:t xml:space="preserve">E-Cig </w:t>
-            </w:r>
-            <w:r>
-              <w:rPr>
-                <w:rFonts w:ascii="Times New Roman" w:hAnsi="Times New Roman" w:cs="Times New Roman"/>
-              </w:rPr>
-              <w:t xml:space="preserve">1-7 classes enumeration </w:t>
-            </w:r>
-            <w:proofErr w:type="spellStart"/>
-            <w:r>
-              <w:rPr>
-                <w:rFonts w:ascii="Times New Roman" w:hAnsi="Times New Roman" w:cs="Times New Roman"/>
-              </w:rPr>
-              <w:t>Mplus</w:t>
-            </w:r>
-            <w:proofErr w:type="spellEnd"/>
-            <w:r>
-              <w:rPr>
-                <w:rFonts w:ascii="Times New Roman" w:hAnsi="Times New Roman" w:cs="Times New Roman"/>
-              </w:rPr>
-              <w:t xml:space="preserve"> outputs generated from </w:t>
-            </w:r>
-            <w:proofErr w:type="spellStart"/>
-            <w:r>
-              <w:rPr>
-                <w:rFonts w:ascii="Times New Roman" w:hAnsi="Times New Roman" w:cs="Times New Roman"/>
-              </w:rPr>
-              <w:t>MplusAutomation</w:t>
-            </w:r>
-            <w:proofErr w:type="spellEnd"/>
-            <w:r>
-              <w:rPr>
-                <w:rFonts w:ascii="Times New Roman" w:hAnsi="Times New Roman" w:cs="Times New Roman"/>
-              </w:rPr>
-              <w:t xml:space="preserve"> (R).</w:t>
+            <w:r>
+              <w:rPr>
+                <w:rFonts w:ascii="Times New Roman" w:hAnsi="Times New Roman" w:cs="Times New Roman"/>
+              </w:rPr>
+              <w:t>scripts</w:t>
+            </w:r>
+          </w:p>
+        </w:tc>
+        <w:tc>
+          <w:tcPr>
+            <w:tcW w:w="3117" w:type="dxa"/>
+          </w:tcPr>
+          <w:p>
+            <w:pPr>
+              <w:rPr>
+                <w:rFonts w:ascii="Times New Roman" w:hAnsi="Times New Roman" w:cs="Times New Roman"/>
+              </w:rPr>
+            </w:pPr>
+            <w:r>
+              <w:rPr>
+                <w:rFonts w:ascii="Times New Roman" w:hAnsi="Times New Roman" w:cs="Times New Roman"/>
+              </w:rPr>
+              <w:t xml:space="preserve">Contains Qmd code and HTML outputs </w:t>
+            </w:r>
+            <w:r>
+              <w:rPr>
+                <w:rFonts w:ascii="Times New Roman" w:hAnsi="Times New Roman" w:cs="Times New Roman"/>
+              </w:rPr>
+              <w:t>for all steps taken to clean raw PATH data and create clean LCA indicators for the analytic sample</w:t>
             </w:r>
           </w:p>
         </w:tc>
@@ -316,103 +252,77 @@
         <w:tc>
           <w:tcPr>
             <w:tcW w:w="3116" w:type="dxa"/>
-            <w:vMerge/>
-          </w:tcPr>
-          <w:p>
-            <w:pPr>
-              <w:rPr>
-                <w:rFonts w:ascii="Times New Roman" w:hAnsi="Times New Roman" w:cs="Times New Roman"/>
-                <w:b/>
-                <w:bCs/>
-              </w:rPr>
-            </w:pPr>
-          </w:p>
-        </w:tc>
-        <w:tc>
-          <w:tcPr>
-            <w:tcW w:w="3117" w:type="dxa"/>
-          </w:tcPr>
-          <w:p>
-            <w:pPr>
-              <w:rPr>
-                <w:rFonts w:ascii="Times New Roman" w:hAnsi="Times New Roman" w:cs="Times New Roman"/>
-              </w:rPr>
-            </w:pPr>
-            <w:proofErr w:type="spellStart"/>
-            <w:r>
-              <w:rPr>
-                <w:rFonts w:ascii="Times New Roman" w:hAnsi="Times New Roman" w:cs="Times New Roman"/>
-              </w:rPr>
-              <w:t>mplus_lca_ecig</w:t>
-            </w:r>
-            <w:r>
-              <w:rPr>
-                <w:rFonts w:ascii="Times New Roman" w:hAnsi="Times New Roman" w:cs="Times New Roman"/>
-              </w:rPr>
-              <w:t>_w</w:t>
-            </w:r>
-            <w:proofErr w:type="spellEnd"/>
-          </w:p>
-        </w:tc>
-        <w:tc>
-          <w:tcPr>
-            <w:tcW w:w="3117" w:type="dxa"/>
-          </w:tcPr>
-          <w:p>
-            <w:pPr>
-              <w:rPr>
-                <w:rFonts w:ascii="Times New Roman" w:hAnsi="Times New Roman" w:cs="Times New Roman"/>
-              </w:rPr>
-            </w:pPr>
-            <w:r>
-              <w:rPr>
-                <w:rFonts w:ascii="Times New Roman" w:hAnsi="Times New Roman" w:cs="Times New Roman"/>
-                <w:b/>
-                <w:bCs/>
-              </w:rPr>
-              <w:t xml:space="preserve">(Weighted) </w:t>
-            </w:r>
-            <w:r>
-              <w:rPr>
-                <w:rFonts w:ascii="Times New Roman" w:hAnsi="Times New Roman" w:cs="Times New Roman"/>
-                <w:b/>
-                <w:bCs/>
-              </w:rPr>
-              <w:t>E-Cig</w:t>
-            </w:r>
-            <w:r>
-              <w:rPr>
-                <w:rFonts w:ascii="Times New Roman" w:hAnsi="Times New Roman" w:cs="Times New Roman"/>
-              </w:rPr>
-              <w:t xml:space="preserve"> 1-7 classes enumeration </w:t>
-            </w:r>
-            <w:proofErr w:type="spellStart"/>
-            <w:r>
-              <w:rPr>
-                <w:rFonts w:ascii="Times New Roman" w:hAnsi="Times New Roman" w:cs="Times New Roman"/>
-              </w:rPr>
-              <w:t>Mplus</w:t>
-            </w:r>
-            <w:proofErr w:type="spellEnd"/>
-            <w:r>
-              <w:rPr>
-                <w:rFonts w:ascii="Times New Roman" w:hAnsi="Times New Roman" w:cs="Times New Roman"/>
-              </w:rPr>
-              <w:t xml:space="preserve"> outputs generated from </w:t>
-            </w:r>
-            <w:proofErr w:type="spellStart"/>
-            <w:r>
-              <w:rPr>
-                <w:rFonts w:ascii="Times New Roman" w:hAnsi="Times New Roman" w:cs="Times New Roman"/>
-              </w:rPr>
-              <w:t>MplusAutomation</w:t>
-            </w:r>
-            <w:proofErr w:type="spellEnd"/>
-            <w:r>
-              <w:rPr>
-                <w:rFonts w:ascii="Times New Roman" w:hAnsi="Times New Roman" w:cs="Times New Roman"/>
-              </w:rPr>
-              <w:t xml:space="preserve"> (R).</w:t>
+            <w:vMerge w:val="restart"/>
+          </w:tcPr>
+          <w:p>
+            <w:pPr>
+              <w:rPr>
+                <w:rFonts w:ascii="Times New Roman" w:hAnsi="Times New Roman" w:cs="Times New Roman"/>
+                <w:b/>
+                <w:bCs/>
+              </w:rPr>
+            </w:pPr>
+          </w:p>
+          <w:p>
+            <w:pPr>
+              <w:rPr>
+                <w:rFonts w:ascii="Times New Roman" w:hAnsi="Times New Roman" w:cs="Times New Roman"/>
+                <w:b/>
+                <w:bCs/>
+              </w:rPr>
+            </w:pPr>
+          </w:p>
+          <w:p>
+            <w:pPr>
+              <w:rPr>
+                <w:rFonts w:ascii="Times New Roman" w:hAnsi="Times New Roman" w:cs="Times New Roman"/>
+                <w:b/>
+                <w:bCs/>
+              </w:rPr>
+            </w:pPr>
+            <w:r>
+              <w:rPr>
+                <w:rFonts w:ascii="Times New Roman" w:hAnsi="Times New Roman" w:cs="Times New Roman"/>
+                <w:b/>
+                <w:bCs/>
+              </w:rPr>
+              <w:t>useme_lca</w:t>
+            </w:r>
+          </w:p>
+        </w:tc>
+        <w:tc>
+          <w:tcPr>
+            <w:tcW w:w="3117" w:type="dxa"/>
+          </w:tcPr>
+          <w:p>
+            <w:pPr>
+              <w:rPr>
+                <w:rFonts w:ascii="Times New Roman" w:hAnsi="Times New Roman" w:cs="Times New Roman"/>
+              </w:rPr>
+            </w:pPr>
+            <w:r>
+              <w:rPr>
+                <w:rFonts w:ascii="Times New Roman" w:hAnsi="Times New Roman" w:cs="Times New Roman"/>
+              </w:rPr>
+              <w:t>data</w:t>
+            </w:r>
+          </w:p>
+        </w:tc>
+        <w:tc>
+          <w:tcPr>
+            <w:tcW w:w="3117" w:type="dxa"/>
+          </w:tcPr>
+          <w:p>
+            <w:pPr>
+              <w:rPr>
+                <w:rFonts w:ascii="Times New Roman" w:hAnsi="Times New Roman" w:cs="Times New Roman"/>
+              </w:rPr>
+            </w:pPr>
+            <w:r>
+              <w:rPr>
+                <w:rFonts w:ascii="Times New Roman" w:hAnsi="Times New Roman" w:cs="Times New Roman"/>
+              </w:rPr>
+              <w:t>raw data after initial cleaning; separate dataframe for e-cig and smokeless.</w:t>
             </w:r>
           </w:p>
         </w:tc>
@@ -443,73 +353,37 @@
                 <w:rFonts w:ascii="Times New Roman" w:hAnsi="Times New Roman" w:cs="Times New Roman"/>
               </w:rPr>
             </w:pPr>
-            <w:proofErr w:type="spellStart"/>
-            <w:r>
-              <w:rPr>
-                <w:rFonts w:ascii="Times New Roman" w:hAnsi="Times New Roman" w:cs="Times New Roman"/>
-              </w:rPr>
-              <w:t>mplus_lca_</w:t>
-            </w:r>
-            <w:r>
-              <w:rPr>
-                <w:rFonts w:ascii="Times New Roman" w:hAnsi="Times New Roman" w:cs="Times New Roman"/>
-              </w:rPr>
-              <w:t>sm</w:t>
-            </w:r>
-            <w:proofErr w:type="spellEnd"/>
-          </w:p>
-        </w:tc>
-        <w:tc>
-          <w:tcPr>
-            <w:tcW w:w="3117" w:type="dxa"/>
-          </w:tcPr>
-          <w:p>
-            <w:pPr>
-              <w:rPr>
-                <w:rFonts w:ascii="Times New Roman" w:hAnsi="Times New Roman" w:cs="Times New Roman"/>
-              </w:rPr>
-            </w:pPr>
-            <w:r>
-              <w:rPr>
-                <w:rFonts w:ascii="Times New Roman" w:hAnsi="Times New Roman" w:cs="Times New Roman"/>
-                <w:b/>
-                <w:bCs/>
-              </w:rPr>
-              <w:t>Smokeless</w:t>
-            </w:r>
-            <w:r>
-              <w:rPr>
-                <w:rFonts w:ascii="Times New Roman" w:hAnsi="Times New Roman" w:cs="Times New Roman"/>
-              </w:rPr>
-              <w:t xml:space="preserve"> 1-7 classes enumeration </w:t>
-            </w:r>
-            <w:proofErr w:type="spellStart"/>
-            <w:r>
-              <w:rPr>
-                <w:rFonts w:ascii="Times New Roman" w:hAnsi="Times New Roman" w:cs="Times New Roman"/>
-              </w:rPr>
-              <w:t>Mplus</w:t>
-            </w:r>
-            <w:proofErr w:type="spellEnd"/>
-            <w:r>
-              <w:rPr>
-                <w:rFonts w:ascii="Times New Roman" w:hAnsi="Times New Roman" w:cs="Times New Roman"/>
-              </w:rPr>
-              <w:t xml:space="preserve"> outputs generated from </w:t>
-            </w:r>
-            <w:proofErr w:type="spellStart"/>
-            <w:r>
-              <w:rPr>
-                <w:rFonts w:ascii="Times New Roman" w:hAnsi="Times New Roman" w:cs="Times New Roman"/>
-              </w:rPr>
-              <w:t>MplusAutomation</w:t>
-            </w:r>
-            <w:proofErr w:type="spellEnd"/>
-            <w:r>
-              <w:rPr>
-                <w:rFonts w:ascii="Times New Roman" w:hAnsi="Times New Roman" w:cs="Times New Roman"/>
-              </w:rPr>
-              <w:t xml:space="preserve"> (R).</w:t>
+            <w:r>
+              <w:rPr>
+                <w:rFonts w:ascii="Times New Roman" w:hAnsi="Times New Roman" w:cs="Times New Roman"/>
+              </w:rPr>
+              <w:t>mplus_lca_ecig</w:t>
+            </w:r>
+          </w:p>
+        </w:tc>
+        <w:tc>
+          <w:tcPr>
+            <w:tcW w:w="3117" w:type="dxa"/>
+          </w:tcPr>
+          <w:p>
+            <w:pPr>
+              <w:rPr>
+                <w:rFonts w:ascii="Times New Roman" w:hAnsi="Times New Roman" w:cs="Times New Roman"/>
+              </w:rPr>
+            </w:pPr>
+            <w:r>
+              <w:rPr>
+                <w:rFonts w:ascii="Times New Roman" w:hAnsi="Times New Roman" w:cs="Times New Roman"/>
+                <w:b/>
+                <w:bCs/>
+              </w:rPr>
+              <w:t xml:space="preserve">E-Cig </w:t>
+            </w:r>
+            <w:r>
+              <w:rPr>
+                <w:rFonts w:ascii="Times New Roman" w:hAnsi="Times New Roman" w:cs="Times New Roman"/>
+              </w:rPr>
+              <w:t>1-7 classes enumeration Mplus outputs generated from MplusAutomation (R).</w:t>
             </w:r>
           </w:p>
         </w:tc>
@@ -540,73 +414,45 @@
                 <w:rFonts w:ascii="Times New Roman" w:hAnsi="Times New Roman" w:cs="Times New Roman"/>
               </w:rPr>
             </w:pPr>
-            <w:proofErr w:type="spellStart"/>
-            <w:r>
-              <w:rPr>
-                <w:rFonts w:ascii="Times New Roman" w:hAnsi="Times New Roman" w:cs="Times New Roman"/>
-              </w:rPr>
-              <w:t>mplus_lca_</w:t>
-            </w:r>
-            <w:r>
-              <w:rPr>
-                <w:rFonts w:ascii="Times New Roman" w:hAnsi="Times New Roman" w:cs="Times New Roman"/>
-              </w:rPr>
-              <w:t>sm_w</w:t>
-            </w:r>
-            <w:proofErr w:type="spellEnd"/>
-          </w:p>
-        </w:tc>
-        <w:tc>
-          <w:tcPr>
-            <w:tcW w:w="3117" w:type="dxa"/>
-          </w:tcPr>
-          <w:p>
-            <w:pPr>
-              <w:rPr>
-                <w:rFonts w:ascii="Times New Roman" w:hAnsi="Times New Roman" w:cs="Times New Roman"/>
-              </w:rPr>
-            </w:pPr>
-            <w:r>
-              <w:rPr>
-                <w:rFonts w:ascii="Times New Roman" w:hAnsi="Times New Roman" w:cs="Times New Roman"/>
-                <w:b/>
-                <w:bCs/>
-              </w:rPr>
-              <w:t>(Weighted) Smokeless</w:t>
-            </w:r>
-            <w:r>
-              <w:rPr>
-                <w:rFonts w:ascii="Times New Roman" w:hAnsi="Times New Roman" w:cs="Times New Roman"/>
-              </w:rPr>
-              <w:t xml:space="preserve"> 1-7 classes enumeration </w:t>
-            </w:r>
-            <w:proofErr w:type="spellStart"/>
-            <w:r>
-              <w:rPr>
-                <w:rFonts w:ascii="Times New Roman" w:hAnsi="Times New Roman" w:cs="Times New Roman"/>
-              </w:rPr>
-              <w:t>Mplus</w:t>
-            </w:r>
-            <w:proofErr w:type="spellEnd"/>
-            <w:r>
-              <w:rPr>
-                <w:rFonts w:ascii="Times New Roman" w:hAnsi="Times New Roman" w:cs="Times New Roman"/>
-              </w:rPr>
-              <w:t xml:space="preserve"> outputs generated from </w:t>
-            </w:r>
-            <w:proofErr w:type="spellStart"/>
-            <w:r>
-              <w:rPr>
-                <w:rFonts w:ascii="Times New Roman" w:hAnsi="Times New Roman" w:cs="Times New Roman"/>
-              </w:rPr>
-              <w:t>MplusAutomation</w:t>
-            </w:r>
-            <w:proofErr w:type="spellEnd"/>
-            <w:r>
-              <w:rPr>
-                <w:rFonts w:ascii="Times New Roman" w:hAnsi="Times New Roman" w:cs="Times New Roman"/>
-              </w:rPr>
-              <w:t xml:space="preserve"> (R).</w:t>
+            <w:r>
+              <w:rPr>
+                <w:rFonts w:ascii="Times New Roman" w:hAnsi="Times New Roman" w:cs="Times New Roman"/>
+              </w:rPr>
+              <w:t>mplus_lca_ecig_w</w:t>
+            </w:r>
+          </w:p>
+        </w:tc>
+        <w:tc>
+          <w:tcPr>
+            <w:tcW w:w="3117" w:type="dxa"/>
+          </w:tcPr>
+          <w:p>
+            <w:pPr>
+              <w:rPr>
+                <w:rFonts w:ascii="Times New Roman" w:hAnsi="Times New Roman" w:cs="Times New Roman"/>
+              </w:rPr>
+            </w:pPr>
+            <w:r>
+              <w:rPr>
+                <w:rFonts w:ascii="Times New Roman" w:hAnsi="Times New Roman" w:cs="Times New Roman"/>
+                <w:b/>
+                <w:bCs/>
+              </w:rPr>
+              <w:t xml:space="preserve">(Weighted) </w:t>
+            </w:r>
+            <w:r>
+              <w:rPr>
+                <w:rFonts w:ascii="Times New Roman" w:hAnsi="Times New Roman" w:cs="Times New Roman"/>
+                <w:b/>
+                <w:bCs/>
+              </w:rPr>
+              <w:t>E-Cig</w:t>
+            </w:r>
+            <w:r>
+              <w:rPr>
+                <w:rFonts w:ascii="Times New Roman" w:hAnsi="Times New Roman" w:cs="Times New Roman"/>
+              </w:rPr>
+              <w:t xml:space="preserve"> 1-7 classes enumeration Mplus outputs generated from MplusAutomation (R).</w:t>
             </w:r>
           </w:p>
         </w:tc>
@@ -641,59 +487,33 @@
               <w:rPr>
                 <w:rFonts w:ascii="Times New Roman" w:hAnsi="Times New Roman" w:cs="Times New Roman"/>
               </w:rPr>
-              <w:t>scripts</w:t>
-            </w:r>
-          </w:p>
-        </w:tc>
-        <w:tc>
-          <w:tcPr>
-            <w:tcW w:w="3117" w:type="dxa"/>
-          </w:tcPr>
-          <w:p>
-            <w:pPr>
-              <w:rPr>
-                <w:rFonts w:ascii="Times New Roman" w:hAnsi="Times New Roman" w:cs="Times New Roman"/>
-              </w:rPr>
-            </w:pPr>
-            <w:r>
-              <w:rPr>
-                <w:rFonts w:ascii="Times New Roman" w:hAnsi="Times New Roman" w:cs="Times New Roman"/>
-              </w:rPr>
-              <w:t xml:space="preserve">Contains </w:t>
-            </w:r>
-            <w:proofErr w:type="spellStart"/>
-            <w:r>
-              <w:rPr>
-                <w:rFonts w:ascii="Times New Roman" w:hAnsi="Times New Roman" w:cs="Times New Roman"/>
-              </w:rPr>
-              <w:t>Qmd</w:t>
-            </w:r>
-            <w:proofErr w:type="spellEnd"/>
-            <w:r>
-              <w:rPr>
-                <w:rFonts w:ascii="Times New Roman" w:hAnsi="Times New Roman" w:cs="Times New Roman"/>
-              </w:rPr>
-              <w:t xml:space="preserve"> codes and HTML outputs for </w:t>
-            </w:r>
-            <w:r>
-              <w:rPr>
-                <w:rFonts w:ascii="Times New Roman" w:hAnsi="Times New Roman" w:cs="Times New Roman"/>
-                <w:b/>
-                <w:bCs/>
-              </w:rPr>
-              <w:t>E-Cig and Smokeless Latent Class Analyses</w:t>
-            </w:r>
-            <w:r>
-              <w:rPr>
-                <w:rFonts w:ascii="Times New Roman" w:hAnsi="Times New Roman" w:cs="Times New Roman"/>
-              </w:rPr>
-              <w:t>.</w:t>
-            </w:r>
-            <w:r>
-              <w:rPr>
-                <w:rFonts w:ascii="Times New Roman" w:hAnsi="Times New Roman" w:cs="Times New Roman"/>
-              </w:rPr>
-              <w:t xml:space="preserve"> Codes include all steps from importing raw data through generating tables/graphs.</w:t>
+              <w:t>mplus_lca_sm</w:t>
+            </w:r>
+          </w:p>
+        </w:tc>
+        <w:tc>
+          <w:tcPr>
+            <w:tcW w:w="3117" w:type="dxa"/>
+          </w:tcPr>
+          <w:p>
+            <w:pPr>
+              <w:rPr>
+                <w:rFonts w:ascii="Times New Roman" w:hAnsi="Times New Roman" w:cs="Times New Roman"/>
+              </w:rPr>
+            </w:pPr>
+            <w:r>
+              <w:rPr>
+                <w:rFonts w:ascii="Times New Roman" w:hAnsi="Times New Roman" w:cs="Times New Roman"/>
+                <w:b/>
+                <w:bCs/>
+              </w:rPr>
+              <w:t>Smokeless</w:t>
+            </w:r>
+            <w:r>
+              <w:rPr>
+                <w:rFonts w:ascii="Times New Roman" w:hAnsi="Times New Roman" w:cs="Times New Roman"/>
+              </w:rPr>
+              <w:t xml:space="preserve"> 1-7 classes enumeration Mplus outputs generated from MplusAutomation (R).</w:t>
             </w:r>
           </w:p>
         </w:tc>
@@ -702,112 +522,59 @@
         <w:tc>
           <w:tcPr>
             <w:tcW w:w="3116" w:type="dxa"/>
-            <w:vMerge w:val="restart"/>
-          </w:tcPr>
-          <w:p>
-            <w:pPr>
-              <w:rPr>
-                <w:rFonts w:ascii="Times New Roman" w:hAnsi="Times New Roman" w:cs="Times New Roman"/>
-                <w:b/>
-                <w:bCs/>
-              </w:rPr>
-            </w:pPr>
-          </w:p>
-          <w:p>
-            <w:pPr>
-              <w:rPr>
-                <w:rFonts w:ascii="Times New Roman" w:hAnsi="Times New Roman" w:cs="Times New Roman"/>
-                <w:b/>
-                <w:bCs/>
-              </w:rPr>
-            </w:pPr>
-            <w:proofErr w:type="spellStart"/>
-            <w:r>
-              <w:rPr>
-                <w:rFonts w:ascii="Times New Roman" w:hAnsi="Times New Roman" w:cs="Times New Roman"/>
-                <w:b/>
-                <w:bCs/>
-              </w:rPr>
-              <w:t>useme_bch</w:t>
-            </w:r>
-            <w:proofErr w:type="spellEnd"/>
-          </w:p>
-        </w:tc>
-        <w:tc>
-          <w:tcPr>
-            <w:tcW w:w="3117" w:type="dxa"/>
-          </w:tcPr>
-          <w:p>
-            <w:pPr>
-              <w:rPr>
-                <w:rFonts w:ascii="Times New Roman" w:hAnsi="Times New Roman" w:cs="Times New Roman"/>
-              </w:rPr>
-            </w:pPr>
-            <w:r>
-              <w:rPr>
-                <w:rFonts w:ascii="Times New Roman" w:hAnsi="Times New Roman" w:cs="Times New Roman"/>
-              </w:rPr>
-              <w:t>data</w:t>
-            </w:r>
-          </w:p>
-        </w:tc>
-        <w:tc>
-          <w:tcPr>
-            <w:tcW w:w="3117" w:type="dxa"/>
-          </w:tcPr>
-          <w:p>
-            <w:pPr>
-              <w:rPr>
-                <w:rFonts w:ascii="Times New Roman" w:hAnsi="Times New Roman" w:cs="Times New Roman"/>
-              </w:rPr>
-            </w:pPr>
-            <w:r>
-              <w:rPr>
-                <w:rFonts w:ascii="Times New Roman" w:hAnsi="Times New Roman" w:cs="Times New Roman"/>
-              </w:rPr>
-              <w:t xml:space="preserve">raw data converted to </w:t>
-            </w:r>
-            <w:proofErr w:type="spellStart"/>
-            <w:r>
-              <w:rPr>
-                <w:rFonts w:ascii="Times New Roman" w:hAnsi="Times New Roman" w:cs="Times New Roman"/>
-              </w:rPr>
-              <w:t>mplus</w:t>
-            </w:r>
-            <w:proofErr w:type="spellEnd"/>
-            <w:r>
-              <w:rPr>
-                <w:rFonts w:ascii="Times New Roman" w:hAnsi="Times New Roman" w:cs="Times New Roman"/>
-              </w:rPr>
-              <w:t xml:space="preserve"> format (missing = 999, no </w:t>
-            </w:r>
-            <w:proofErr w:type="spellStart"/>
-            <w:r>
-              <w:rPr>
-                <w:rFonts w:ascii="Times New Roman" w:hAnsi="Times New Roman" w:cs="Times New Roman"/>
-              </w:rPr>
-              <w:t>caseid</w:t>
-            </w:r>
-            <w:proofErr w:type="spellEnd"/>
-            <w:r>
-              <w:rPr>
-                <w:rFonts w:ascii="Times New Roman" w:hAnsi="Times New Roman" w:cs="Times New Roman"/>
-              </w:rPr>
-              <w:t xml:space="preserve"> or a column for variable names); separate </w:t>
-            </w:r>
-            <w:proofErr w:type="spellStart"/>
-            <w:r>
-              <w:rPr>
-                <w:rFonts w:ascii="Times New Roman" w:hAnsi="Times New Roman" w:cs="Times New Roman"/>
-              </w:rPr>
-              <w:t>dataframe</w:t>
-            </w:r>
-            <w:proofErr w:type="spellEnd"/>
-            <w:r>
-              <w:rPr>
-                <w:rFonts w:ascii="Times New Roman" w:hAnsi="Times New Roman" w:cs="Times New Roman"/>
-              </w:rPr>
-              <w:t xml:space="preserve"> for e-cig and smokeless.</w:t>
+            <w:vMerge/>
+          </w:tcPr>
+          <w:p>
+            <w:pPr>
+              <w:rPr>
+                <w:rFonts w:ascii="Times New Roman" w:hAnsi="Times New Roman" w:cs="Times New Roman"/>
+                <w:b/>
+                <w:bCs/>
+              </w:rPr>
+            </w:pPr>
+          </w:p>
+        </w:tc>
+        <w:tc>
+          <w:tcPr>
+            <w:tcW w:w="3117" w:type="dxa"/>
+          </w:tcPr>
+          <w:p>
+            <w:pPr>
+              <w:rPr>
+                <w:rFonts w:ascii="Times New Roman" w:hAnsi="Times New Roman" w:cs="Times New Roman"/>
+              </w:rPr>
+            </w:pPr>
+            <w:r>
+              <w:rPr>
+                <w:rFonts w:ascii="Times New Roman" w:hAnsi="Times New Roman" w:cs="Times New Roman"/>
+              </w:rPr>
+              <w:t>mplus_lca_sm_w</w:t>
+            </w:r>
+          </w:p>
+        </w:tc>
+        <w:tc>
+          <w:tcPr>
+            <w:tcW w:w="3117" w:type="dxa"/>
+          </w:tcPr>
+          <w:p>
+            <w:pPr>
+              <w:rPr>
+                <w:rFonts w:ascii="Times New Roman" w:hAnsi="Times New Roman" w:cs="Times New Roman"/>
+              </w:rPr>
+            </w:pPr>
+            <w:r>
+              <w:rPr>
+                <w:rFonts w:ascii="Times New Roman" w:hAnsi="Times New Roman" w:cs="Times New Roman"/>
+                <w:b/>
+                <w:bCs/>
+              </w:rPr>
+              <w:t>(Weighted) Smokeless</w:t>
+            </w:r>
+            <w:r>
+              <w:rPr>
+                <w:rFonts w:ascii="Times New Roman" w:hAnsi="Times New Roman" w:cs="Times New Roman"/>
+              </w:rPr>
+              <w:t xml:space="preserve"> 1-7 classes enumeration Mplus outputs generated from MplusAutomation (R).</w:t>
             </w:r>
           </w:p>
         </w:tc>
@@ -838,67 +605,49 @@
                 <w:rFonts w:ascii="Times New Roman" w:hAnsi="Times New Roman" w:cs="Times New Roman"/>
               </w:rPr>
             </w:pPr>
-            <w:proofErr w:type="spellStart"/>
-            <w:r>
-              <w:rPr>
-                <w:rFonts w:ascii="Times New Roman" w:hAnsi="Times New Roman" w:cs="Times New Roman"/>
-              </w:rPr>
-              <w:t>Mplus</w:t>
-            </w:r>
-            <w:proofErr w:type="spellEnd"/>
-            <w:r>
-              <w:rPr>
-                <w:rFonts w:ascii="Times New Roman" w:hAnsi="Times New Roman" w:cs="Times New Roman"/>
-              </w:rPr>
-              <w:t xml:space="preserve"> Code</w:t>
-            </w:r>
-          </w:p>
-        </w:tc>
-        <w:tc>
-          <w:tcPr>
-            <w:tcW w:w="3117" w:type="dxa"/>
-          </w:tcPr>
-          <w:p>
-            <w:pPr>
-              <w:rPr>
-                <w:rFonts w:ascii="Times New Roman" w:hAnsi="Times New Roman" w:cs="Times New Roman"/>
-              </w:rPr>
-            </w:pPr>
-            <w:r>
-              <w:rPr>
-                <w:rFonts w:ascii="Times New Roman" w:hAnsi="Times New Roman" w:cs="Times New Roman"/>
-              </w:rPr>
-              <w:t xml:space="preserve">Codes for </w:t>
-            </w:r>
-            <w:r>
-              <w:rPr>
-                <w:rFonts w:ascii="Times New Roman" w:hAnsi="Times New Roman" w:cs="Times New Roman"/>
-                <w:b/>
-                <w:bCs/>
-              </w:rPr>
-              <w:t xml:space="preserve">4class Model </w:t>
-            </w:r>
-            <w:r>
-              <w:rPr>
-                <w:rFonts w:ascii="Times New Roman" w:hAnsi="Times New Roman" w:cs="Times New Roman" w:hint="eastAsia"/>
-                <w:b/>
-                <w:bCs/>
-              </w:rPr>
-              <w:sym w:font="Wingdings" w:char="F0E0"/>
-            </w:r>
-            <w:r>
-              <w:rPr>
-                <w:rFonts w:ascii="Times New Roman" w:hAnsi="Times New Roman" w:cs="Times New Roman"/>
-                <w:b/>
-                <w:bCs/>
-              </w:rPr>
-              <w:t xml:space="preserve"> BCH distal outcomes</w:t>
-            </w:r>
-            <w:r>
-              <w:rPr>
-                <w:rFonts w:ascii="Times New Roman" w:hAnsi="Times New Roman" w:cs="Times New Roman"/>
-              </w:rPr>
-              <w:t xml:space="preserve"> (ethnicity, gender, age, income, whether child tried e-cig or smokeless) for both E-Cig and Smokeless.</w:t>
+            <w:r>
+              <w:rPr>
+                <w:rFonts w:ascii="Times New Roman" w:hAnsi="Times New Roman" w:cs="Times New Roman"/>
+              </w:rPr>
+              <w:t>scripts</w:t>
+            </w:r>
+          </w:p>
+        </w:tc>
+        <w:tc>
+          <w:tcPr>
+            <w:tcW w:w="3117" w:type="dxa"/>
+          </w:tcPr>
+          <w:p>
+            <w:pPr>
+              <w:rPr>
+                <w:rFonts w:ascii="Times New Roman" w:hAnsi="Times New Roman" w:cs="Times New Roman"/>
+              </w:rPr>
+            </w:pPr>
+            <w:r>
+              <w:rPr>
+                <w:rFonts w:ascii="Times New Roman" w:hAnsi="Times New Roman" w:cs="Times New Roman"/>
+              </w:rPr>
+              <w:t xml:space="preserve">Contains Qmd code and HTML outputs for </w:t>
+            </w:r>
+            <w:r>
+              <w:rPr>
+                <w:rFonts w:ascii="Times New Roman" w:hAnsi="Times New Roman" w:cs="Times New Roman"/>
+                <w:b/>
+                <w:bCs/>
+              </w:rPr>
+              <w:t>E-Cig and Smokeless Latent Class Analyses</w:t>
+            </w:r>
+            <w:r>
+              <w:rPr>
+                <w:rFonts w:ascii="Times New Roman" w:hAnsi="Times New Roman" w:cs="Times New Roman"/>
+              </w:rPr>
+              <w:t>.</w:t>
+            </w:r>
+            <w:r>
+              <w:rPr>
+                <w:rFonts w:ascii="Times New Roman" w:hAnsi="Times New Roman" w:cs="Times New Roman"/>
+              </w:rPr>
+              <w:t xml:space="preserve"> Codes include all steps from importing raw data through generating tables/graphs.</w:t>
             </w:r>
           </w:p>
         </w:tc>
@@ -907,6 +656,83 @@
         <w:tc>
           <w:tcPr>
             <w:tcW w:w="3116" w:type="dxa"/>
+            <w:vMerge w:val="restart"/>
+          </w:tcPr>
+          <w:p>
+            <w:pPr>
+              <w:rPr>
+                <w:rFonts w:ascii="Times New Roman" w:hAnsi="Times New Roman" w:cs="Times New Roman"/>
+                <w:b/>
+                <w:bCs/>
+              </w:rPr>
+            </w:pPr>
+          </w:p>
+          <w:p>
+            <w:pPr>
+              <w:rPr>
+                <w:rFonts w:ascii="Times New Roman" w:hAnsi="Times New Roman" w:cs="Times New Roman"/>
+                <w:b/>
+                <w:bCs/>
+              </w:rPr>
+            </w:pPr>
+            <w:r>
+              <w:rPr>
+                <w:rFonts w:ascii="Times New Roman" w:hAnsi="Times New Roman" w:cs="Times New Roman"/>
+                <w:b/>
+                <w:bCs/>
+              </w:rPr>
+              <w:t>useme_bch</w:t>
+            </w:r>
+          </w:p>
+        </w:tc>
+        <w:tc>
+          <w:tcPr>
+            <w:tcW w:w="3117" w:type="dxa"/>
+          </w:tcPr>
+          <w:p>
+            <w:pPr>
+              <w:rPr>
+                <w:rFonts w:ascii="Times New Roman" w:hAnsi="Times New Roman" w:cs="Times New Roman"/>
+              </w:rPr>
+            </w:pPr>
+            <w:r>
+              <w:rPr>
+                <w:rFonts w:ascii="Times New Roman" w:hAnsi="Times New Roman" w:cs="Times New Roman"/>
+              </w:rPr>
+              <w:t>data</w:t>
+            </w:r>
+          </w:p>
+        </w:tc>
+        <w:tc>
+          <w:tcPr>
+            <w:tcW w:w="3117" w:type="dxa"/>
+          </w:tcPr>
+          <w:p>
+            <w:pPr>
+              <w:rPr>
+                <w:rFonts w:ascii="Times New Roman" w:hAnsi="Times New Roman" w:cs="Times New Roman"/>
+              </w:rPr>
+            </w:pPr>
+            <w:r>
+              <w:rPr>
+                <w:rFonts w:ascii="Times New Roman" w:hAnsi="Times New Roman" w:cs="Times New Roman"/>
+              </w:rPr>
+              <w:t xml:space="preserve">raw data converted to mplus format (missing = 999, no caseid or a column for variable names); separate </w:t>
+            </w:r>
+            <w:r>
+              <w:rPr>
+                <w:rFonts w:ascii="Times New Roman" w:hAnsi="Times New Roman" w:cs="Times New Roman"/>
+              </w:rPr>
+              <w:lastRenderedPageBreak/>
+              <w:t>dataframe for e-cig and smokeless.</w:t>
+            </w:r>
+          </w:p>
+        </w:tc>
+      </w:tr>
+      <w:tr>
+        <w:tc>
+          <w:tcPr>
+            <w:tcW w:w="3116" w:type="dxa"/>
             <w:vMerge/>
           </w:tcPr>
           <w:p>
@@ -929,19 +755,106 @@
                 <w:rFonts w:ascii="Times New Roman" w:hAnsi="Times New Roman" w:cs="Times New Roman"/>
               </w:rPr>
             </w:pPr>
-            <w:proofErr w:type="spellStart"/>
-            <w:r>
-              <w:rPr>
-                <w:rFonts w:ascii="Times New Roman" w:hAnsi="Times New Roman" w:cs="Times New Roman"/>
-              </w:rPr>
-              <w:t>Mplus</w:t>
-            </w:r>
-            <w:proofErr w:type="spellEnd"/>
-            <w:r>
-              <w:rPr>
-                <w:rFonts w:ascii="Times New Roman" w:hAnsi="Times New Roman" w:cs="Times New Roman"/>
-              </w:rPr>
-              <w:t xml:space="preserve"> Output</w:t>
+            <w:r>
+              <w:rPr>
+                <w:rFonts w:ascii="Times New Roman" w:hAnsi="Times New Roman" w:cs="Times New Roman"/>
+              </w:rPr>
+              <w:t>Mplus Code</w:t>
+            </w:r>
+          </w:p>
+        </w:tc>
+        <w:tc>
+          <w:tcPr>
+            <w:tcW w:w="3117" w:type="dxa"/>
+          </w:tcPr>
+          <w:p>
+            <w:pPr>
+              <w:rPr>
+                <w:rFonts w:ascii="Times New Roman" w:hAnsi="Times New Roman" w:cs="Times New Roman"/>
+              </w:rPr>
+            </w:pPr>
+            <w:r>
+              <w:rPr>
+                <w:rFonts w:ascii="Times New Roman" w:hAnsi="Times New Roman" w:cs="Times New Roman"/>
+              </w:rPr>
+              <w:t>Code</w:t>
+            </w:r>
+            <w:r>
+              <w:rPr>
+                <w:rFonts w:ascii="Times New Roman" w:hAnsi="Times New Roman" w:cs="Times New Roman"/>
+              </w:rPr>
+              <w:t xml:space="preserve"> </w:t>
+            </w:r>
+            <w:r>
+              <w:rPr>
+                <w:rFonts w:ascii="Times New Roman" w:hAnsi="Times New Roman" w:cs="Times New Roman"/>
+              </w:rPr>
+              <w:t xml:space="preserve">for </w:t>
+            </w:r>
+            <w:r>
+              <w:rPr>
+                <w:rFonts w:ascii="Times New Roman" w:hAnsi="Times New Roman" w:cs="Times New Roman"/>
+                <w:b/>
+                <w:bCs/>
+              </w:rPr>
+              <w:t xml:space="preserve">4class Model </w:t>
+            </w:r>
+            <w:r>
+              <w:rPr>
+                <w:rFonts w:ascii="Times New Roman" w:hAnsi="Times New Roman" w:cs="Times New Roman" w:hint="eastAsia"/>
+                <w:b/>
+                <w:bCs/>
+              </w:rPr>
+              <w:sym w:font="Wingdings" w:char="F0E0"/>
+            </w:r>
+            <w:r>
+              <w:rPr>
+                <w:rFonts w:ascii="Times New Roman" w:hAnsi="Times New Roman" w:cs="Times New Roman"/>
+                <w:b/>
+                <w:bCs/>
+              </w:rPr>
+              <w:t xml:space="preserve"> BCH distal outcomes</w:t>
+            </w:r>
+            <w:r>
+              <w:rPr>
+                <w:rFonts w:ascii="Times New Roman" w:hAnsi="Times New Roman" w:cs="Times New Roman"/>
+              </w:rPr>
+              <w:t xml:space="preserve"> (ethnicity, gender, age, income, whether child tried e-cig or smokeless) for both E-Cig and Smokeless.</w:t>
+            </w:r>
+          </w:p>
+        </w:tc>
+      </w:tr>
+      <w:tr>
+        <w:tc>
+          <w:tcPr>
+            <w:tcW w:w="3116" w:type="dxa"/>
+            <w:vMerge/>
+          </w:tcPr>
+          <w:p>
+            <w:pPr>
+              <w:rPr>
+                <w:rFonts w:ascii="Times New Roman" w:hAnsi="Times New Roman" w:cs="Times New Roman"/>
+                <w:b/>
+                <w:bCs/>
+              </w:rPr>
+            </w:pPr>
+          </w:p>
+        </w:tc>
+        <w:tc>
+          <w:tcPr>
+            <w:tcW w:w="3117" w:type="dxa"/>
+          </w:tcPr>
+          <w:p>
+            <w:pPr>
+              <w:rPr>
+                <w:rFonts w:ascii="Times New Roman" w:hAnsi="Times New Roman" w:cs="Times New Roman"/>
+              </w:rPr>
+            </w:pPr>
+            <w:r>
+              <w:rPr>
+                <w:rFonts w:ascii="Times New Roman" w:hAnsi="Times New Roman" w:cs="Times New Roman"/>
+              </w:rPr>
+              <w:t>Mplus Output</w:t>
             </w:r>
           </w:p>
         </w:tc>
@@ -1621,6 +1534,7 @@
   <w:style w:type="character" w:default="1" w:styleId="DefaultParagraphFont">
     <w:name w:val="Default Paragraph Font"/>
     <w:uiPriority w:val="1"/>
+    <w:semiHidden/>
     <w:unhideWhenUsed/>
   </w:style>
   <w:style w:type="table" w:default="1" w:styleId="TableNormal">

</xml_diff>

<commit_message>
LCA Figures Updated 8.6.26 CS
Updated LCA figures for journal requirement; updated readme file for organization.
</commit_message>
<xml_diff>
--- a/OrganizationREADME.docx
+++ b/OrganizationREADME.docx
@@ -1,6 +1,6 @@
 
 <file path=word/document.xml><?xml version="1.0" encoding="utf-8"?>
-<w:document xmlns:wpc="http://schemas.microsoft.com/office/word/2010/wordprocessingCanvas" xmlns:cx="http://schemas.microsoft.com/office/drawing/2014/chartex" xmlns:cx1="http://schemas.microsoft.com/office/drawing/2015/9/8/chartex" xmlns:cx2="http://schemas.microsoft.com/office/drawing/2015/10/21/chartex" xmlns:cx3="http://schemas.microsoft.com/office/drawing/2016/5/9/chartex" xmlns:cx4="http://schemas.microsoft.com/office/drawing/2016/5/10/chartex" xmlns:cx5="http://schemas.microsoft.com/office/drawing/2016/5/11/chartex" xmlns:cx6="http://schemas.microsoft.com/office/drawing/2016/5/12/chartex" xmlns:cx7="http://schemas.microsoft.com/office/drawing/2016/5/13/chartex" xmlns:cx8="http://schemas.microsoft.com/office/drawing/2016/5/14/chartex" xmlns:mc="http://schemas.openxmlformats.org/markup-compatibility/2006" xmlns:aink="http://schemas.microsoft.com/office/drawing/2016/ink" xmlns:am3d="http://schemas.microsoft.com/office/drawing/2017/model3d" xmlns:o="urn:schemas-microsoft-com:office:office" xmlns:oel="http://schemas.microsoft.com/office/2019/extlst" xmlns:r="http://schemas.openxmlformats.org/officeDocument/2006/relationships" xmlns:m="http://schemas.openxmlformats.org/officeDocument/2006/math" xmlns:v="urn:schemas-microsoft-com:vml" xmlns:wp14="http://schemas.microsoft.com/office/word/2010/wordprocessingDrawing" xmlns:wp="http://schemas.openxmlformats.org/drawingml/2006/wordprocessingDrawing" xmlns:w10="urn:schemas-microsoft-com:office:word" xmlns:w="http://schemas.openxmlformats.org/wordprocessingml/2006/main" xmlns:w14="http://schemas.microsoft.com/office/word/2010/wordml" xmlns:w15="http://schemas.microsoft.com/office/word/2012/wordml" xmlns:w16cex="http://schemas.microsoft.com/office/word/2018/wordml/cex" xmlns:w16cid="http://schemas.microsoft.com/office/word/2016/wordml/cid" xmlns:w16="http://schemas.microsoft.com/office/word/2018/wordml" xmlns:w16du="http://schemas.microsoft.com/office/word/2023/wordml/word16du" xmlns:w16sdtdh="http://schemas.microsoft.com/office/word/2020/wordml/sdtdatahash" xmlns:w16sdtfl="http://schemas.microsoft.com/office/word/2024/wordml/sdtformatlock" xmlns:w16se="http://schemas.microsoft.com/office/word/2015/wordml/symex" xmlns:wpg="http://schemas.microsoft.com/office/word/2010/wordprocessingGroup" xmlns:wpi="http://schemas.microsoft.com/office/word/2010/wordprocessingInk" xmlns:wne="http://schemas.microsoft.com/office/word/2006/wordml" xmlns:wps="http://schemas.microsoft.com/office/word/2010/wordprocessingShape" mc:Ignorable="w14 w15 w16se w16cid w16 w16cex w16sdtdh w16sdtfl w16du wp14">
+<w:document xmlns:wpc="http://schemas.microsoft.com/office/word/2010/wordprocessingCanvas" xmlns:cx="http://schemas.microsoft.com/office/drawing/2014/chartex" xmlns:cx1="http://schemas.microsoft.com/office/drawing/2015/9/8/chartex" xmlns:cx2="http://schemas.microsoft.com/office/drawing/2015/10/21/chartex" xmlns:cx3="http://schemas.microsoft.com/office/drawing/2016/5/9/chartex" xmlns:cx4="http://schemas.microsoft.com/office/drawing/2016/5/10/chartex" xmlns:cx5="http://schemas.microsoft.com/office/drawing/2016/5/11/chartex" xmlns:cx6="http://schemas.microsoft.com/office/drawing/2016/5/12/chartex" xmlns:cx7="http://schemas.microsoft.com/office/drawing/2016/5/13/chartex" xmlns:cx8="http://schemas.microsoft.com/office/drawing/2016/5/14/chartex" xmlns:mc="http://schemas.openxmlformats.org/markup-compatibility/2006" xmlns:aink="http://schemas.microsoft.com/office/drawing/2016/ink" xmlns:am3d="http://schemas.microsoft.com/office/drawing/2017/model3d" xmlns:o="urn:schemas-microsoft-com:office:office" xmlns:oel="http://schemas.microsoft.com/office/2019/extlst" xmlns:r="http://schemas.openxmlformats.org/officeDocument/2006/relationships" xmlns:m="http://schemas.openxmlformats.org/officeDocument/2006/math" xmlns:v="urn:schemas-microsoft-com:vml" xmlns:wp14="http://schemas.microsoft.com/office/word/2010/wordprocessingDrawing" xmlns:wp="http://schemas.openxmlformats.org/drawingml/2006/wordprocessingDrawing" xmlns:w10="urn:schemas-microsoft-com:office:word" xmlns:w="http://schemas.openxmlformats.org/wordprocessingml/2006/main" xmlns:w14="http://schemas.microsoft.com/office/word/2010/wordml" xmlns:w15="http://schemas.microsoft.com/office/word/2012/wordml" xmlns:w16cei="http://schemas.microsoft.com/office/word/2026/wordml/cei" xmlns:w16cex="http://schemas.microsoft.com/office/word/2018/wordml/cex" xmlns:w16cid="http://schemas.microsoft.com/office/word/2016/wordml/cid" xmlns:w16="http://schemas.microsoft.com/office/word/2018/wordml" xmlns:w16du="http://schemas.microsoft.com/office/word/2023/wordml/word16du" xmlns:w16sdtdh="http://schemas.microsoft.com/office/word/2020/wordml/sdtdatahash" xmlns:w16sdtfl="http://schemas.microsoft.com/office/word/2024/wordml/sdtformatlock" xmlns:w16se="http://schemas.microsoft.com/office/word/2015/wordml/symex" xmlns:wpg="http://schemas.microsoft.com/office/word/2010/wordprocessingGroup" xmlns:wpi="http://schemas.microsoft.com/office/word/2010/wordprocessingInk" xmlns:wne="http://schemas.microsoft.com/office/word/2006/wordml" xmlns:wps="http://schemas.microsoft.com/office/word/2010/wordprocessingShape" mc:Ignorable="w14 w15 w16se w16cid w16 w16cex w16sdtdh w16sdtfl w16du wp14">
   <w:body>
     <w:p>
       <w:pPr>
@@ -12,7 +12,7 @@
         <w:rPr>
           <w:rFonts w:ascii="Times New Roman" w:hAnsi="Times New Roman" w:cs="Times New Roman"/>
         </w:rPr>
-        <w:t>Analyses Archiving Folders:</w:t>
+        <w:t>Here’s how the Data Analyses and Cleaning folders are organized for this study:</w:t>
       </w:r>
     </w:p>
     <w:p>
@@ -21,25 +21,6 @@
           <w:rFonts w:ascii="Times New Roman" w:hAnsi="Times New Roman" w:cs="Times New Roman"/>
         </w:rPr>
       </w:pPr>
-      <w:r>
-        <w:rPr>
-          <w:rFonts w:ascii="Times New Roman" w:hAnsi="Times New Roman" w:cs="Times New Roman"/>
-        </w:rPr>
-        <w:t>Raw data and Data Cleaning?</w:t>
-      </w:r>
-    </w:p>
-    <w:p>
-      <w:pPr>
-        <w:rPr>
-          <w:rFonts w:ascii="Times New Roman" w:hAnsi="Times New Roman" w:cs="Times New Roman"/>
-        </w:rPr>
-      </w:pPr>
-      <w:r>
-        <w:rPr>
-          <w:rFonts w:ascii="Times New Roman" w:hAnsi="Times New Roman" w:cs="Times New Roman"/>
-        </w:rPr>
-        <w:t>Descriptives?</w:t>
-      </w:r>
     </w:p>
     <w:tbl>
       <w:tblPr>
@@ -134,22 +115,16 @@
                 <w:bCs/>
               </w:rPr>
             </w:pPr>
-            <w:r>
-              <w:rPr>
-                <w:rFonts w:ascii="Times New Roman" w:hAnsi="Times New Roman" w:cs="Times New Roman"/>
-                <w:b/>
-                <w:bCs/>
-              </w:rPr>
-              <w:t>useme_</w:t>
-            </w:r>
-            <w:r>
-              <w:rPr>
-                <w:rFonts w:ascii="Times New Roman" w:hAnsi="Times New Roman" w:cs="Times New Roman"/>
-                <w:b/>
-                <w:bCs/>
-              </w:rPr>
-              <w:t>data_cleaning</w:t>
-            </w:r>
+            <w:proofErr w:type="spellStart"/>
+            <w:r>
+              <w:rPr>
+                <w:rFonts w:ascii="Times New Roman" w:hAnsi="Times New Roman" w:cs="Times New Roman"/>
+                <w:b/>
+                <w:bCs/>
+              </w:rPr>
+              <w:t>useme_data_cleaning</w:t>
+            </w:r>
+            <w:proofErr w:type="spellEnd"/>
           </w:p>
         </w:tc>
         <w:tc>
@@ -237,13 +212,21 @@
               <w:rPr>
                 <w:rFonts w:ascii="Times New Roman" w:hAnsi="Times New Roman" w:cs="Times New Roman"/>
               </w:rPr>
-              <w:t xml:space="preserve">Contains Qmd code and HTML outputs </w:t>
-            </w:r>
-            <w:r>
-              <w:rPr>
-                <w:rFonts w:ascii="Times New Roman" w:hAnsi="Times New Roman" w:cs="Times New Roman"/>
-              </w:rPr>
-              <w:t>for all steps taken to clean raw PATH data and create clean LCA indicators for the analytic sample</w:t>
+              <w:t xml:space="preserve">Contains </w:t>
+            </w:r>
+            <w:proofErr w:type="spellStart"/>
+            <w:r>
+              <w:rPr>
+                <w:rFonts w:ascii="Times New Roman" w:hAnsi="Times New Roman" w:cs="Times New Roman"/>
+              </w:rPr>
+              <w:t>Qmd</w:t>
+            </w:r>
+            <w:proofErr w:type="spellEnd"/>
+            <w:r>
+              <w:rPr>
+                <w:rFonts w:ascii="Times New Roman" w:hAnsi="Times New Roman" w:cs="Times New Roman"/>
+              </w:rPr>
+              <w:t xml:space="preserve"> code and HTML outputs for all steps taken to clean raw PATH data and create clean LCA indicators for the analytic sample</w:t>
             </w:r>
           </w:p>
         </w:tc>
@@ -280,6 +263,7 @@
                 <w:bCs/>
               </w:rPr>
             </w:pPr>
+            <w:proofErr w:type="spellStart"/>
             <w:r>
               <w:rPr>
                 <w:rFonts w:ascii="Times New Roman" w:hAnsi="Times New Roman" w:cs="Times New Roman"/>
@@ -288,6 +272,7 @@
               </w:rPr>
               <w:t>useme_lca</w:t>
             </w:r>
+            <w:proofErr w:type="spellEnd"/>
           </w:p>
         </w:tc>
         <w:tc>
@@ -322,7 +307,27 @@
               <w:rPr>
                 <w:rFonts w:ascii="Times New Roman" w:hAnsi="Times New Roman" w:cs="Times New Roman"/>
               </w:rPr>
-              <w:t>raw data after initial cleaning; separate dataframe for e-cig and smokeless.</w:t>
+              <w:t>R</w:t>
+            </w:r>
+            <w:r>
+              <w:rPr>
+                <w:rFonts w:ascii="Times New Roman" w:hAnsi="Times New Roman" w:cs="Times New Roman"/>
+              </w:rPr>
+              <w:t xml:space="preserve">aw data after initial cleaning; separate </w:t>
+            </w:r>
+            <w:proofErr w:type="spellStart"/>
+            <w:r>
+              <w:rPr>
+                <w:rFonts w:ascii="Times New Roman" w:hAnsi="Times New Roman" w:cs="Times New Roman"/>
+              </w:rPr>
+              <w:t>dataframe</w:t>
+            </w:r>
+            <w:proofErr w:type="spellEnd"/>
+            <w:r>
+              <w:rPr>
+                <w:rFonts w:ascii="Times New Roman" w:hAnsi="Times New Roman" w:cs="Times New Roman"/>
+              </w:rPr>
+              <w:t xml:space="preserve"> for e-cig and smokeless.</w:t>
             </w:r>
           </w:p>
         </w:tc>
@@ -357,33 +362,39 @@
               <w:rPr>
                 <w:rFonts w:ascii="Times New Roman" w:hAnsi="Times New Roman" w:cs="Times New Roman"/>
               </w:rPr>
-              <w:t>mplus_lca_ecig</w:t>
-            </w:r>
-          </w:p>
-        </w:tc>
-        <w:tc>
-          <w:tcPr>
-            <w:tcW w:w="3117" w:type="dxa"/>
-          </w:tcPr>
-          <w:p>
-            <w:pPr>
-              <w:rPr>
-                <w:rFonts w:ascii="Times New Roman" w:hAnsi="Times New Roman" w:cs="Times New Roman"/>
-              </w:rPr>
-            </w:pPr>
-            <w:r>
-              <w:rPr>
-                <w:rFonts w:ascii="Times New Roman" w:hAnsi="Times New Roman" w:cs="Times New Roman"/>
-                <w:b/>
-                <w:bCs/>
-              </w:rPr>
-              <w:t xml:space="preserve">E-Cig </w:t>
-            </w:r>
-            <w:r>
-              <w:rPr>
-                <w:rFonts w:ascii="Times New Roman" w:hAnsi="Times New Roman" w:cs="Times New Roman"/>
-              </w:rPr>
-              <w:t>1-7 classes enumeration Mplus outputs generated from MplusAutomation (R).</w:t>
+              <w:t>figures</w:t>
+            </w:r>
+          </w:p>
+        </w:tc>
+        <w:tc>
+          <w:tcPr>
+            <w:tcW w:w="3117" w:type="dxa"/>
+          </w:tcPr>
+          <w:p>
+            <w:pPr>
+              <w:rPr>
+                <w:rFonts w:ascii="Times New Roman" w:hAnsi="Times New Roman" w:cs="Times New Roman"/>
+              </w:rPr>
+            </w:pPr>
+            <w:r>
+              <w:rPr>
+                <w:rFonts w:ascii="Times New Roman" w:hAnsi="Times New Roman" w:cs="Times New Roman"/>
+              </w:rPr>
+              <w:t xml:space="preserve">Four class solution figures for both </w:t>
+            </w:r>
+            <w:r>
+              <w:rPr>
+                <w:rFonts w:ascii="Times New Roman" w:hAnsi="Times New Roman" w:cs="Times New Roman"/>
+                <w:b/>
+                <w:bCs/>
+              </w:rPr>
+              <w:t>E-Cig and Smokeless Latent Class Analyses</w:t>
+            </w:r>
+            <w:r>
+              <w:rPr>
+                <w:rFonts w:ascii="Times New Roman" w:hAnsi="Times New Roman" w:cs="Times New Roman"/>
+              </w:rPr>
+              <w:t>.</w:t>
             </w:r>
           </w:p>
         </w:tc>
@@ -414,45 +425,67 @@
                 <w:rFonts w:ascii="Times New Roman" w:hAnsi="Times New Roman" w:cs="Times New Roman"/>
               </w:rPr>
             </w:pPr>
-            <w:r>
-              <w:rPr>
-                <w:rFonts w:ascii="Times New Roman" w:hAnsi="Times New Roman" w:cs="Times New Roman"/>
-              </w:rPr>
-              <w:t>mplus_lca_ecig_w</w:t>
-            </w:r>
-          </w:p>
-        </w:tc>
-        <w:tc>
-          <w:tcPr>
-            <w:tcW w:w="3117" w:type="dxa"/>
-          </w:tcPr>
-          <w:p>
-            <w:pPr>
-              <w:rPr>
-                <w:rFonts w:ascii="Times New Roman" w:hAnsi="Times New Roman" w:cs="Times New Roman"/>
-              </w:rPr>
-            </w:pPr>
-            <w:r>
-              <w:rPr>
-                <w:rFonts w:ascii="Times New Roman" w:hAnsi="Times New Roman" w:cs="Times New Roman"/>
-                <w:b/>
-                <w:bCs/>
-              </w:rPr>
-              <w:t xml:space="preserve">(Weighted) </w:t>
-            </w:r>
-            <w:r>
-              <w:rPr>
-                <w:rFonts w:ascii="Times New Roman" w:hAnsi="Times New Roman" w:cs="Times New Roman"/>
-                <w:b/>
-                <w:bCs/>
-              </w:rPr>
-              <w:t>E-Cig</w:t>
-            </w:r>
-            <w:r>
-              <w:rPr>
-                <w:rFonts w:ascii="Times New Roman" w:hAnsi="Times New Roman" w:cs="Times New Roman"/>
-              </w:rPr>
-              <w:t xml:space="preserve"> 1-7 classes enumeration Mplus outputs generated from MplusAutomation (R).</w:t>
+            <w:proofErr w:type="spellStart"/>
+            <w:r>
+              <w:rPr>
+                <w:rFonts w:ascii="Times New Roman" w:hAnsi="Times New Roman" w:cs="Times New Roman"/>
+              </w:rPr>
+              <w:t>mplus_lca_ecig</w:t>
+            </w:r>
+            <w:proofErr w:type="spellEnd"/>
+          </w:p>
+        </w:tc>
+        <w:tc>
+          <w:tcPr>
+            <w:tcW w:w="3117" w:type="dxa"/>
+          </w:tcPr>
+          <w:p>
+            <w:pPr>
+              <w:rPr>
+                <w:rFonts w:ascii="Times New Roman" w:hAnsi="Times New Roman" w:cs="Times New Roman"/>
+              </w:rPr>
+            </w:pPr>
+            <w:r>
+              <w:rPr>
+                <w:rFonts w:ascii="Times New Roman" w:hAnsi="Times New Roman" w:cs="Times New Roman"/>
+                <w:b/>
+                <w:bCs/>
+              </w:rPr>
+              <w:t xml:space="preserve">E-Cig </w:t>
+            </w:r>
+            <w:r>
+              <w:rPr>
+                <w:rFonts w:ascii="Times New Roman" w:hAnsi="Times New Roman" w:cs="Times New Roman"/>
+              </w:rPr>
+              <w:t xml:space="preserve">1-7 classes enumeration </w:t>
+            </w:r>
+            <w:proofErr w:type="spellStart"/>
+            <w:r>
+              <w:rPr>
+                <w:rFonts w:ascii="Times New Roman" w:hAnsi="Times New Roman" w:cs="Times New Roman"/>
+              </w:rPr>
+              <w:t>Mplus</w:t>
+            </w:r>
+            <w:proofErr w:type="spellEnd"/>
+            <w:r>
+              <w:rPr>
+                <w:rFonts w:ascii="Times New Roman" w:hAnsi="Times New Roman" w:cs="Times New Roman"/>
+              </w:rPr>
+              <w:t xml:space="preserve"> outputs generated from </w:t>
+            </w:r>
+            <w:proofErr w:type="spellStart"/>
+            <w:r>
+              <w:rPr>
+                <w:rFonts w:ascii="Times New Roman" w:hAnsi="Times New Roman" w:cs="Times New Roman"/>
+              </w:rPr>
+              <w:t>MplusAutomation</w:t>
+            </w:r>
+            <w:proofErr w:type="spellEnd"/>
+            <w:r>
+              <w:rPr>
+                <w:rFonts w:ascii="Times New Roman" w:hAnsi="Times New Roman" w:cs="Times New Roman"/>
+              </w:rPr>
+              <w:t xml:space="preserve"> (R).</w:t>
             </w:r>
           </w:p>
         </w:tc>
@@ -483,37 +516,75 @@
                 <w:rFonts w:ascii="Times New Roman" w:hAnsi="Times New Roman" w:cs="Times New Roman"/>
               </w:rPr>
             </w:pPr>
-            <w:r>
-              <w:rPr>
-                <w:rFonts w:ascii="Times New Roman" w:hAnsi="Times New Roman" w:cs="Times New Roman"/>
-              </w:rPr>
-              <w:t>mplus_lca_sm</w:t>
-            </w:r>
-          </w:p>
-        </w:tc>
-        <w:tc>
-          <w:tcPr>
-            <w:tcW w:w="3117" w:type="dxa"/>
-          </w:tcPr>
-          <w:p>
-            <w:pPr>
-              <w:rPr>
-                <w:rFonts w:ascii="Times New Roman" w:hAnsi="Times New Roman" w:cs="Times New Roman"/>
-              </w:rPr>
-            </w:pPr>
-            <w:r>
-              <w:rPr>
-                <w:rFonts w:ascii="Times New Roman" w:hAnsi="Times New Roman" w:cs="Times New Roman"/>
-                <w:b/>
-                <w:bCs/>
-              </w:rPr>
-              <w:t>Smokeless</w:t>
-            </w:r>
-            <w:r>
-              <w:rPr>
-                <w:rFonts w:ascii="Times New Roman" w:hAnsi="Times New Roman" w:cs="Times New Roman"/>
-              </w:rPr>
-              <w:t xml:space="preserve"> 1-7 classes enumeration Mplus outputs generated from MplusAutomation (R).</w:t>
+            <w:proofErr w:type="spellStart"/>
+            <w:r>
+              <w:rPr>
+                <w:rFonts w:ascii="Times New Roman" w:hAnsi="Times New Roman" w:cs="Times New Roman"/>
+              </w:rPr>
+              <w:t>mplus_lca_ecig_w</w:t>
+            </w:r>
+            <w:proofErr w:type="spellEnd"/>
+          </w:p>
+        </w:tc>
+        <w:tc>
+          <w:tcPr>
+            <w:tcW w:w="3117" w:type="dxa"/>
+          </w:tcPr>
+          <w:p>
+            <w:pPr>
+              <w:rPr>
+                <w:rFonts w:ascii="Times New Roman" w:hAnsi="Times New Roman" w:cs="Times New Roman"/>
+              </w:rPr>
+            </w:pPr>
+            <w:r>
+              <w:rPr>
+                <w:rFonts w:ascii="Times New Roman" w:hAnsi="Times New Roman" w:cs="Times New Roman"/>
+                <w:b/>
+                <w:bCs/>
+              </w:rPr>
+              <w:t xml:space="preserve">(Weighted) </w:t>
+            </w:r>
+            <w:r>
+              <w:rPr>
+                <w:rFonts w:ascii="Times New Roman" w:hAnsi="Times New Roman" w:cs="Times New Roman"/>
+                <w:b/>
+                <w:bCs/>
+              </w:rPr>
+              <w:t>E-Cig</w:t>
+            </w:r>
+            <w:r>
+              <w:rPr>
+                <w:rFonts w:ascii="Times New Roman" w:hAnsi="Times New Roman" w:cs="Times New Roman"/>
+              </w:rPr>
+              <w:t xml:space="preserve"> 1-7 classes enumeration </w:t>
+            </w:r>
+            <w:proofErr w:type="spellStart"/>
+            <w:r>
+              <w:rPr>
+                <w:rFonts w:ascii="Times New Roman" w:hAnsi="Times New Roman" w:cs="Times New Roman"/>
+              </w:rPr>
+              <w:t>Mplus</w:t>
+            </w:r>
+            <w:proofErr w:type="spellEnd"/>
+            <w:r>
+              <w:rPr>
+                <w:rFonts w:ascii="Times New Roman" w:hAnsi="Times New Roman" w:cs="Times New Roman"/>
+              </w:rPr>
+              <w:t xml:space="preserve"> outputs generated from </w:t>
+            </w:r>
+            <w:proofErr w:type="spellStart"/>
+            <w:r>
+              <w:rPr>
+                <w:rFonts w:ascii="Times New Roman" w:hAnsi="Times New Roman" w:cs="Times New Roman"/>
+              </w:rPr>
+              <w:t>MplusAutomation</w:t>
+            </w:r>
+            <w:proofErr w:type="spellEnd"/>
+            <w:r>
+              <w:rPr>
+                <w:rFonts w:ascii="Times New Roman" w:hAnsi="Times New Roman" w:cs="Times New Roman"/>
+              </w:rPr>
+              <w:t xml:space="preserve"> (R).</w:t>
             </w:r>
           </w:p>
         </w:tc>
@@ -544,37 +615,67 @@
                 <w:rFonts w:ascii="Times New Roman" w:hAnsi="Times New Roman" w:cs="Times New Roman"/>
               </w:rPr>
             </w:pPr>
-            <w:r>
-              <w:rPr>
-                <w:rFonts w:ascii="Times New Roman" w:hAnsi="Times New Roman" w:cs="Times New Roman"/>
-              </w:rPr>
-              <w:t>mplus_lca_sm_w</w:t>
-            </w:r>
-          </w:p>
-        </w:tc>
-        <w:tc>
-          <w:tcPr>
-            <w:tcW w:w="3117" w:type="dxa"/>
-          </w:tcPr>
-          <w:p>
-            <w:pPr>
-              <w:rPr>
-                <w:rFonts w:ascii="Times New Roman" w:hAnsi="Times New Roman" w:cs="Times New Roman"/>
-              </w:rPr>
-            </w:pPr>
-            <w:r>
-              <w:rPr>
-                <w:rFonts w:ascii="Times New Roman" w:hAnsi="Times New Roman" w:cs="Times New Roman"/>
-                <w:b/>
-                <w:bCs/>
-              </w:rPr>
-              <w:t>(Weighted) Smokeless</w:t>
-            </w:r>
-            <w:r>
-              <w:rPr>
-                <w:rFonts w:ascii="Times New Roman" w:hAnsi="Times New Roman" w:cs="Times New Roman"/>
-              </w:rPr>
-              <w:t xml:space="preserve"> 1-7 classes enumeration Mplus outputs generated from MplusAutomation (R).</w:t>
+            <w:proofErr w:type="spellStart"/>
+            <w:r>
+              <w:rPr>
+                <w:rFonts w:ascii="Times New Roman" w:hAnsi="Times New Roman" w:cs="Times New Roman"/>
+              </w:rPr>
+              <w:t>mplus_lca_sm</w:t>
+            </w:r>
+            <w:proofErr w:type="spellEnd"/>
+          </w:p>
+        </w:tc>
+        <w:tc>
+          <w:tcPr>
+            <w:tcW w:w="3117" w:type="dxa"/>
+          </w:tcPr>
+          <w:p>
+            <w:pPr>
+              <w:rPr>
+                <w:rFonts w:ascii="Times New Roman" w:hAnsi="Times New Roman" w:cs="Times New Roman"/>
+              </w:rPr>
+            </w:pPr>
+            <w:r>
+              <w:rPr>
+                <w:rFonts w:ascii="Times New Roman" w:hAnsi="Times New Roman" w:cs="Times New Roman"/>
+                <w:b/>
+                <w:bCs/>
+              </w:rPr>
+              <w:t>Smokeless</w:t>
+            </w:r>
+            <w:r>
+              <w:rPr>
+                <w:rFonts w:ascii="Times New Roman" w:hAnsi="Times New Roman" w:cs="Times New Roman"/>
+              </w:rPr>
+              <w:t xml:space="preserve"> 1-7 classes enumeration </w:t>
+            </w:r>
+            <w:proofErr w:type="spellStart"/>
+            <w:r>
+              <w:rPr>
+                <w:rFonts w:ascii="Times New Roman" w:hAnsi="Times New Roman" w:cs="Times New Roman"/>
+              </w:rPr>
+              <w:t>Mplus</w:t>
+            </w:r>
+            <w:proofErr w:type="spellEnd"/>
+            <w:r>
+              <w:rPr>
+                <w:rFonts w:ascii="Times New Roman" w:hAnsi="Times New Roman" w:cs="Times New Roman"/>
+              </w:rPr>
+              <w:t xml:space="preserve"> outputs generated from </w:t>
+            </w:r>
+            <w:proofErr w:type="spellStart"/>
+            <w:r>
+              <w:rPr>
+                <w:rFonts w:ascii="Times New Roman" w:hAnsi="Times New Roman" w:cs="Times New Roman"/>
+              </w:rPr>
+              <w:t>MplusAutomation</w:t>
+            </w:r>
+            <w:proofErr w:type="spellEnd"/>
+            <w:r>
+              <w:rPr>
+                <w:rFonts w:ascii="Times New Roman" w:hAnsi="Times New Roman" w:cs="Times New Roman"/>
+              </w:rPr>
+              <w:t xml:space="preserve"> (R).</w:t>
             </w:r>
           </w:p>
         </w:tc>
@@ -605,49 +706,67 @@
                 <w:rFonts w:ascii="Times New Roman" w:hAnsi="Times New Roman" w:cs="Times New Roman"/>
               </w:rPr>
             </w:pPr>
-            <w:r>
-              <w:rPr>
-                <w:rFonts w:ascii="Times New Roman" w:hAnsi="Times New Roman" w:cs="Times New Roman"/>
-              </w:rPr>
-              <w:t>scripts</w:t>
-            </w:r>
-          </w:p>
-        </w:tc>
-        <w:tc>
-          <w:tcPr>
-            <w:tcW w:w="3117" w:type="dxa"/>
-          </w:tcPr>
-          <w:p>
-            <w:pPr>
-              <w:rPr>
-                <w:rFonts w:ascii="Times New Roman" w:hAnsi="Times New Roman" w:cs="Times New Roman"/>
-              </w:rPr>
-            </w:pPr>
-            <w:r>
-              <w:rPr>
-                <w:rFonts w:ascii="Times New Roman" w:hAnsi="Times New Roman" w:cs="Times New Roman"/>
-              </w:rPr>
-              <w:t xml:space="preserve">Contains Qmd code and HTML outputs for </w:t>
-            </w:r>
-            <w:r>
-              <w:rPr>
-                <w:rFonts w:ascii="Times New Roman" w:hAnsi="Times New Roman" w:cs="Times New Roman"/>
-                <w:b/>
-                <w:bCs/>
-              </w:rPr>
-              <w:t>E-Cig and Smokeless Latent Class Analyses</w:t>
-            </w:r>
-            <w:r>
-              <w:rPr>
-                <w:rFonts w:ascii="Times New Roman" w:hAnsi="Times New Roman" w:cs="Times New Roman"/>
-              </w:rPr>
-              <w:t>.</w:t>
-            </w:r>
-            <w:r>
-              <w:rPr>
-                <w:rFonts w:ascii="Times New Roman" w:hAnsi="Times New Roman" w:cs="Times New Roman"/>
-              </w:rPr>
-              <w:t xml:space="preserve"> Codes include all steps from importing raw data through generating tables/graphs.</w:t>
+            <w:proofErr w:type="spellStart"/>
+            <w:r>
+              <w:rPr>
+                <w:rFonts w:ascii="Times New Roman" w:hAnsi="Times New Roman" w:cs="Times New Roman"/>
+              </w:rPr>
+              <w:t>mplus_lca_sm_w</w:t>
+            </w:r>
+            <w:proofErr w:type="spellEnd"/>
+          </w:p>
+        </w:tc>
+        <w:tc>
+          <w:tcPr>
+            <w:tcW w:w="3117" w:type="dxa"/>
+          </w:tcPr>
+          <w:p>
+            <w:pPr>
+              <w:rPr>
+                <w:rFonts w:ascii="Times New Roman" w:hAnsi="Times New Roman" w:cs="Times New Roman"/>
+              </w:rPr>
+            </w:pPr>
+            <w:r>
+              <w:rPr>
+                <w:rFonts w:ascii="Times New Roman" w:hAnsi="Times New Roman" w:cs="Times New Roman"/>
+                <w:b/>
+                <w:bCs/>
+              </w:rPr>
+              <w:t>(Weighted) Smokeless</w:t>
+            </w:r>
+            <w:r>
+              <w:rPr>
+                <w:rFonts w:ascii="Times New Roman" w:hAnsi="Times New Roman" w:cs="Times New Roman"/>
+              </w:rPr>
+              <w:t xml:space="preserve"> 1-7 classes enumeration </w:t>
+            </w:r>
+            <w:proofErr w:type="spellStart"/>
+            <w:r>
+              <w:rPr>
+                <w:rFonts w:ascii="Times New Roman" w:hAnsi="Times New Roman" w:cs="Times New Roman"/>
+              </w:rPr>
+              <w:t>Mplus</w:t>
+            </w:r>
+            <w:proofErr w:type="spellEnd"/>
+            <w:r>
+              <w:rPr>
+                <w:rFonts w:ascii="Times New Roman" w:hAnsi="Times New Roman" w:cs="Times New Roman"/>
+              </w:rPr>
+              <w:t xml:space="preserve"> outputs generated from </w:t>
+            </w:r>
+            <w:proofErr w:type="spellStart"/>
+            <w:r>
+              <w:rPr>
+                <w:rFonts w:ascii="Times New Roman" w:hAnsi="Times New Roman" w:cs="Times New Roman"/>
+              </w:rPr>
+              <w:t>MplusAutomation</w:t>
+            </w:r>
+            <w:proofErr w:type="spellEnd"/>
+            <w:r>
+              <w:rPr>
+                <w:rFonts w:ascii="Times New Roman" w:hAnsi="Times New Roman" w:cs="Times New Roman"/>
+              </w:rPr>
+              <w:t xml:space="preserve"> (R).</w:t>
             </w:r>
           </w:p>
         </w:tc>
@@ -656,75 +775,85 @@
         <w:tc>
           <w:tcPr>
             <w:tcW w:w="3116" w:type="dxa"/>
-            <w:vMerge w:val="restart"/>
-          </w:tcPr>
-          <w:p>
-            <w:pPr>
-              <w:rPr>
-                <w:rFonts w:ascii="Times New Roman" w:hAnsi="Times New Roman" w:cs="Times New Roman"/>
-                <w:b/>
-                <w:bCs/>
-              </w:rPr>
-            </w:pPr>
-          </w:p>
-          <w:p>
-            <w:pPr>
-              <w:rPr>
-                <w:rFonts w:ascii="Times New Roman" w:hAnsi="Times New Roman" w:cs="Times New Roman"/>
-                <w:b/>
-                <w:bCs/>
-              </w:rPr>
-            </w:pPr>
-            <w:r>
-              <w:rPr>
-                <w:rFonts w:ascii="Times New Roman" w:hAnsi="Times New Roman" w:cs="Times New Roman"/>
-                <w:b/>
-                <w:bCs/>
-              </w:rPr>
-              <w:t>useme_bch</w:t>
-            </w:r>
-          </w:p>
-        </w:tc>
-        <w:tc>
-          <w:tcPr>
-            <w:tcW w:w="3117" w:type="dxa"/>
-          </w:tcPr>
-          <w:p>
-            <w:pPr>
-              <w:rPr>
-                <w:rFonts w:ascii="Times New Roman" w:hAnsi="Times New Roman" w:cs="Times New Roman"/>
-              </w:rPr>
-            </w:pPr>
-            <w:r>
-              <w:rPr>
-                <w:rFonts w:ascii="Times New Roman" w:hAnsi="Times New Roman" w:cs="Times New Roman"/>
-              </w:rPr>
-              <w:t>data</w:t>
-            </w:r>
-          </w:p>
-        </w:tc>
-        <w:tc>
-          <w:tcPr>
-            <w:tcW w:w="3117" w:type="dxa"/>
-          </w:tcPr>
-          <w:p>
-            <w:pPr>
-              <w:rPr>
-                <w:rFonts w:ascii="Times New Roman" w:hAnsi="Times New Roman" w:cs="Times New Roman"/>
-              </w:rPr>
-            </w:pPr>
-            <w:r>
-              <w:rPr>
-                <w:rFonts w:ascii="Times New Roman" w:hAnsi="Times New Roman" w:cs="Times New Roman"/>
-              </w:rPr>
-              <w:t xml:space="preserve">raw data converted to mplus format (missing = 999, no caseid or a column for variable names); separate </w:t>
-            </w:r>
-            <w:r>
-              <w:rPr>
-                <w:rFonts w:ascii="Times New Roman" w:hAnsi="Times New Roman" w:cs="Times New Roman"/>
-              </w:rPr>
-              <w:lastRenderedPageBreak/>
-              <w:t>dataframe for e-cig and smokeless.</w:t>
+            <w:vMerge/>
+          </w:tcPr>
+          <w:p>
+            <w:pPr>
+              <w:rPr>
+                <w:rFonts w:ascii="Times New Roman" w:hAnsi="Times New Roman" w:cs="Times New Roman"/>
+                <w:b/>
+                <w:bCs/>
+              </w:rPr>
+            </w:pPr>
+          </w:p>
+        </w:tc>
+        <w:tc>
+          <w:tcPr>
+            <w:tcW w:w="3117" w:type="dxa"/>
+          </w:tcPr>
+          <w:p>
+            <w:pPr>
+              <w:rPr>
+                <w:rFonts w:ascii="Times New Roman" w:hAnsi="Times New Roman" w:cs="Times New Roman"/>
+              </w:rPr>
+            </w:pPr>
+            <w:r>
+              <w:rPr>
+                <w:rFonts w:ascii="Times New Roman" w:hAnsi="Times New Roman" w:cs="Times New Roman"/>
+              </w:rPr>
+              <w:t>scripts</w:t>
+            </w:r>
+          </w:p>
+        </w:tc>
+        <w:tc>
+          <w:tcPr>
+            <w:tcW w:w="3117" w:type="dxa"/>
+          </w:tcPr>
+          <w:p>
+            <w:pPr>
+              <w:rPr>
+                <w:rFonts w:ascii="Times New Roman" w:hAnsi="Times New Roman" w:cs="Times New Roman"/>
+              </w:rPr>
+            </w:pPr>
+            <w:r>
+              <w:rPr>
+                <w:rFonts w:ascii="Times New Roman" w:hAnsi="Times New Roman" w:cs="Times New Roman"/>
+              </w:rPr>
+              <w:t xml:space="preserve">Contains </w:t>
+            </w:r>
+            <w:proofErr w:type="spellStart"/>
+            <w:r>
+              <w:rPr>
+                <w:rFonts w:ascii="Times New Roman" w:hAnsi="Times New Roman" w:cs="Times New Roman"/>
+              </w:rPr>
+              <w:t>Qmd</w:t>
+            </w:r>
+            <w:proofErr w:type="spellEnd"/>
+            <w:r>
+              <w:rPr>
+                <w:rFonts w:ascii="Times New Roman" w:hAnsi="Times New Roman" w:cs="Times New Roman"/>
+              </w:rPr>
+              <w:t xml:space="preserve"> code and HTML outputs for </w:t>
+            </w:r>
+            <w:r>
+              <w:rPr>
+                <w:rFonts w:ascii="Times New Roman" w:hAnsi="Times New Roman" w:cs="Times New Roman"/>
+                <w:b/>
+                <w:bCs/>
+              </w:rPr>
+              <w:t>E-Cig and Smokeless Latent Class Analyses</w:t>
+            </w:r>
+            <w:r>
+              <w:rPr>
+                <w:rFonts w:ascii="Times New Roman" w:hAnsi="Times New Roman" w:cs="Times New Roman"/>
+              </w:rPr>
+              <w:t>.</w:t>
+            </w:r>
+            <w:r>
+              <w:rPr>
+                <w:rFonts w:ascii="Times New Roman" w:hAnsi="Times New Roman" w:cs="Times New Roman"/>
+              </w:rPr>
+              <w:t xml:space="preserve"> Codes include all steps from importing raw data through generating tables/graphs.</w:t>
             </w:r>
           </w:p>
         </w:tc>
@@ -733,93 +862,113 @@
         <w:tc>
           <w:tcPr>
             <w:tcW w:w="3116" w:type="dxa"/>
-            <w:vMerge/>
-          </w:tcPr>
-          <w:p>
-            <w:pPr>
-              <w:rPr>
-                <w:rFonts w:ascii="Times New Roman" w:hAnsi="Times New Roman" w:cs="Times New Roman"/>
-                <w:b/>
-                <w:bCs/>
-              </w:rPr>
-            </w:pPr>
-          </w:p>
-        </w:tc>
-        <w:tc>
-          <w:tcPr>
-            <w:tcW w:w="3117" w:type="dxa"/>
-          </w:tcPr>
-          <w:p>
-            <w:pPr>
-              <w:rPr>
-                <w:rFonts w:ascii="Times New Roman" w:hAnsi="Times New Roman" w:cs="Times New Roman"/>
-              </w:rPr>
-            </w:pPr>
-            <w:r>
-              <w:rPr>
-                <w:rFonts w:ascii="Times New Roman" w:hAnsi="Times New Roman" w:cs="Times New Roman"/>
-              </w:rPr>
-              <w:t>Mplus Code</w:t>
-            </w:r>
-          </w:p>
-        </w:tc>
-        <w:tc>
-          <w:tcPr>
-            <w:tcW w:w="3117" w:type="dxa"/>
-          </w:tcPr>
-          <w:p>
-            <w:pPr>
-              <w:rPr>
-                <w:rFonts w:ascii="Times New Roman" w:hAnsi="Times New Roman" w:cs="Times New Roman"/>
-              </w:rPr>
-            </w:pPr>
-            <w:r>
-              <w:rPr>
-                <w:rFonts w:ascii="Times New Roman" w:hAnsi="Times New Roman" w:cs="Times New Roman"/>
-              </w:rPr>
-              <w:t>Code</w:t>
-            </w:r>
-            <w:r>
-              <w:rPr>
-                <w:rFonts w:ascii="Times New Roman" w:hAnsi="Times New Roman" w:cs="Times New Roman"/>
-              </w:rPr>
-              <w:t xml:space="preserve"> </w:t>
-            </w:r>
-            <w:r>
-              <w:rPr>
-                <w:rFonts w:ascii="Times New Roman" w:hAnsi="Times New Roman" w:cs="Times New Roman"/>
-              </w:rPr>
-              <w:t xml:space="preserve">for </w:t>
-            </w:r>
-            <w:r>
-              <w:rPr>
-                <w:rFonts w:ascii="Times New Roman" w:hAnsi="Times New Roman" w:cs="Times New Roman"/>
-                <w:b/>
-                <w:bCs/>
-              </w:rPr>
-              <w:t xml:space="preserve">4class Model </w:t>
-            </w:r>
-            <w:r>
-              <w:rPr>
-                <w:rFonts w:ascii="Times New Roman" w:hAnsi="Times New Roman" w:cs="Times New Roman" w:hint="eastAsia"/>
-                <w:b/>
-                <w:bCs/>
-              </w:rPr>
-              <w:sym w:font="Wingdings" w:char="F0E0"/>
-            </w:r>
-            <w:r>
-              <w:rPr>
-                <w:rFonts w:ascii="Times New Roman" w:hAnsi="Times New Roman" w:cs="Times New Roman"/>
-                <w:b/>
-                <w:bCs/>
-              </w:rPr>
-              <w:t xml:space="preserve"> BCH distal outcomes</w:t>
-            </w:r>
-            <w:r>
-              <w:rPr>
-                <w:rFonts w:ascii="Times New Roman" w:hAnsi="Times New Roman" w:cs="Times New Roman"/>
-              </w:rPr>
-              <w:t xml:space="preserve"> (ethnicity, gender, age, income, whether child tried e-cig or smokeless) for both E-Cig and Smokeless.</w:t>
+            <w:vMerge w:val="restart"/>
+          </w:tcPr>
+          <w:p>
+            <w:pPr>
+              <w:rPr>
+                <w:rFonts w:ascii="Times New Roman" w:hAnsi="Times New Roman" w:cs="Times New Roman"/>
+                <w:b/>
+                <w:bCs/>
+              </w:rPr>
+            </w:pPr>
+          </w:p>
+          <w:p>
+            <w:pPr>
+              <w:rPr>
+                <w:rFonts w:ascii="Times New Roman" w:hAnsi="Times New Roman" w:cs="Times New Roman"/>
+                <w:b/>
+                <w:bCs/>
+              </w:rPr>
+            </w:pPr>
+            <w:proofErr w:type="spellStart"/>
+            <w:r>
+              <w:rPr>
+                <w:rFonts w:ascii="Times New Roman" w:hAnsi="Times New Roman" w:cs="Times New Roman"/>
+                <w:b/>
+                <w:bCs/>
+              </w:rPr>
+              <w:t>useme_bch</w:t>
+            </w:r>
+            <w:proofErr w:type="spellEnd"/>
+          </w:p>
+        </w:tc>
+        <w:tc>
+          <w:tcPr>
+            <w:tcW w:w="3117" w:type="dxa"/>
+          </w:tcPr>
+          <w:p>
+            <w:pPr>
+              <w:rPr>
+                <w:rFonts w:ascii="Times New Roman" w:hAnsi="Times New Roman" w:cs="Times New Roman"/>
+              </w:rPr>
+            </w:pPr>
+            <w:r>
+              <w:rPr>
+                <w:rFonts w:ascii="Times New Roman" w:hAnsi="Times New Roman" w:cs="Times New Roman"/>
+              </w:rPr>
+              <w:t>data</w:t>
+            </w:r>
+          </w:p>
+        </w:tc>
+        <w:tc>
+          <w:tcPr>
+            <w:tcW w:w="3117" w:type="dxa"/>
+          </w:tcPr>
+          <w:p>
+            <w:pPr>
+              <w:rPr>
+                <w:rFonts w:ascii="Times New Roman" w:hAnsi="Times New Roman" w:cs="Times New Roman"/>
+              </w:rPr>
+            </w:pPr>
+            <w:r>
+              <w:rPr>
+                <w:rFonts w:ascii="Times New Roman" w:hAnsi="Times New Roman" w:cs="Times New Roman"/>
+              </w:rPr>
+              <w:t xml:space="preserve">raw data converted to </w:t>
+            </w:r>
+            <w:proofErr w:type="spellStart"/>
+            <w:r>
+              <w:rPr>
+                <w:rFonts w:ascii="Times New Roman" w:hAnsi="Times New Roman" w:cs="Times New Roman"/>
+              </w:rPr>
+              <w:t>mplus</w:t>
+            </w:r>
+            <w:proofErr w:type="spellEnd"/>
+            <w:r>
+              <w:rPr>
+                <w:rFonts w:ascii="Times New Roman" w:hAnsi="Times New Roman" w:cs="Times New Roman"/>
+              </w:rPr>
+              <w:t xml:space="preserve"> format (missing = 999, no </w:t>
+            </w:r>
+            <w:proofErr w:type="spellStart"/>
+            <w:r>
+              <w:rPr>
+                <w:rFonts w:ascii="Times New Roman" w:hAnsi="Times New Roman" w:cs="Times New Roman"/>
+              </w:rPr>
+              <w:t>caseid</w:t>
+            </w:r>
+            <w:proofErr w:type="spellEnd"/>
+            <w:r>
+              <w:rPr>
+                <w:rFonts w:ascii="Times New Roman" w:hAnsi="Times New Roman" w:cs="Times New Roman"/>
+              </w:rPr>
+              <w:t xml:space="preserve"> or a column for variable names); separate </w:t>
+            </w:r>
+            <w:proofErr w:type="spellStart"/>
+            <w:r>
+              <w:rPr>
+                <w:rFonts w:ascii="Times New Roman" w:hAnsi="Times New Roman" w:cs="Times New Roman"/>
+              </w:rPr>
+              <w:lastRenderedPageBreak/>
+              <w:t>dataframe</w:t>
+            </w:r>
+            <w:proofErr w:type="spellEnd"/>
+            <w:r>
+              <w:rPr>
+                <w:rFonts w:ascii="Times New Roman" w:hAnsi="Times New Roman" w:cs="Times New Roman"/>
+              </w:rPr>
+              <w:t xml:space="preserve"> for e-cig and smokeless.</w:t>
             </w:r>
           </w:p>
         </w:tc>
@@ -850,29 +999,79 @@
                 <w:rFonts w:ascii="Times New Roman" w:hAnsi="Times New Roman" w:cs="Times New Roman"/>
               </w:rPr>
             </w:pPr>
-            <w:r>
-              <w:rPr>
-                <w:rFonts w:ascii="Times New Roman" w:hAnsi="Times New Roman" w:cs="Times New Roman"/>
-              </w:rPr>
-              <w:t>Mplus Output</w:t>
-            </w:r>
-          </w:p>
-        </w:tc>
-        <w:tc>
-          <w:tcPr>
-            <w:tcW w:w="3117" w:type="dxa"/>
-          </w:tcPr>
-          <w:p>
-            <w:pPr>
-              <w:rPr>
-                <w:rFonts w:ascii="Times New Roman" w:hAnsi="Times New Roman" w:cs="Times New Roman"/>
-              </w:rPr>
-            </w:pPr>
-            <w:r>
-              <w:rPr>
-                <w:rFonts w:ascii="Times New Roman" w:hAnsi="Times New Roman" w:cs="Times New Roman"/>
-              </w:rPr>
-              <w:t>TXT and HTML outputs of BCH outcomes for both E-Cig and Smokeless.</w:t>
+            <w:proofErr w:type="spellStart"/>
+            <w:r>
+              <w:rPr>
+                <w:rFonts w:ascii="Times New Roman" w:hAnsi="Times New Roman" w:cs="Times New Roman"/>
+              </w:rPr>
+              <w:t>Mplus</w:t>
+            </w:r>
+            <w:proofErr w:type="spellEnd"/>
+            <w:r>
+              <w:rPr>
+                <w:rFonts w:ascii="Times New Roman" w:hAnsi="Times New Roman" w:cs="Times New Roman"/>
+              </w:rPr>
+              <w:t xml:space="preserve"> Code</w:t>
+            </w:r>
+          </w:p>
+        </w:tc>
+        <w:tc>
+          <w:tcPr>
+            <w:tcW w:w="3117" w:type="dxa"/>
+          </w:tcPr>
+          <w:p>
+            <w:pPr>
+              <w:rPr>
+                <w:rFonts w:ascii="Times New Roman" w:hAnsi="Times New Roman" w:cs="Times New Roman"/>
+              </w:rPr>
+            </w:pPr>
+            <w:r>
+              <w:rPr>
+                <w:rFonts w:ascii="Times New Roman" w:hAnsi="Times New Roman" w:cs="Times New Roman"/>
+              </w:rPr>
+              <w:t>Code</w:t>
+            </w:r>
+            <w:r>
+              <w:rPr>
+                <w:rFonts w:ascii="Times New Roman" w:hAnsi="Times New Roman" w:cs="Times New Roman"/>
+              </w:rPr>
+              <w:t xml:space="preserve"> </w:t>
+            </w:r>
+            <w:r>
+              <w:rPr>
+                <w:rFonts w:ascii="Times New Roman" w:hAnsi="Times New Roman" w:cs="Times New Roman"/>
+              </w:rPr>
+              <w:t xml:space="preserve">for </w:t>
+            </w:r>
+            <w:r>
+              <w:rPr>
+                <w:rFonts w:ascii="Times New Roman" w:hAnsi="Times New Roman" w:cs="Times New Roman"/>
+                <w:b/>
+                <w:bCs/>
+              </w:rPr>
+              <w:t xml:space="preserve">4class Model </w:t>
+            </w:r>
+            <w:r>
+              <w:rPr>
+                <w:rFonts w:ascii="Times New Roman" w:hAnsi="Times New Roman" w:cs="Times New Roman" w:hint="eastAsia"/>
+                <w:b/>
+                <w:bCs/>
+              </w:rPr>
+              <w:sym w:font="Wingdings" w:char="F0E0"/>
+            </w:r>
+            <w:r>
+              <w:rPr>
+                <w:rFonts w:ascii="Times New Roman" w:hAnsi="Times New Roman" w:cs="Times New Roman"/>
+                <w:b/>
+                <w:bCs/>
+              </w:rPr>
+              <w:t xml:space="preserve"> BCH distal outcomes</w:t>
+            </w:r>
+            <w:r>
+              <w:rPr>
+                <w:rFonts w:ascii="Times New Roman" w:hAnsi="Times New Roman" w:cs="Times New Roman"/>
+              </w:rPr>
+              <w:t xml:space="preserve"> (ethnicity, gender, age, income, whether child tried e-cig or smokeless) for both E-Cig and Smokeless.</w:t>
             </w:r>
           </w:p>
         </w:tc>
@@ -881,39 +1080,60 @@
         <w:tc>
           <w:tcPr>
             <w:tcW w:w="3116" w:type="dxa"/>
-          </w:tcPr>
-          <w:p>
-            <w:pPr>
-              <w:rPr>
-                <w:rFonts w:ascii="Times New Roman" w:hAnsi="Times New Roman" w:cs="Times New Roman"/>
-                <w:b/>
-                <w:bCs/>
-              </w:rPr>
-            </w:pPr>
-          </w:p>
-        </w:tc>
-        <w:tc>
-          <w:tcPr>
-            <w:tcW w:w="3117" w:type="dxa"/>
-          </w:tcPr>
-          <w:p>
-            <w:pPr>
-              <w:rPr>
-                <w:rFonts w:ascii="Times New Roman" w:hAnsi="Times New Roman" w:cs="Times New Roman"/>
-              </w:rPr>
-            </w:pPr>
-          </w:p>
-        </w:tc>
-        <w:tc>
-          <w:tcPr>
-            <w:tcW w:w="3117" w:type="dxa"/>
-          </w:tcPr>
-          <w:p>
-            <w:pPr>
-              <w:rPr>
-                <w:rFonts w:ascii="Times New Roman" w:hAnsi="Times New Roman" w:cs="Times New Roman"/>
-              </w:rPr>
-            </w:pPr>
+            <w:vMerge/>
+          </w:tcPr>
+          <w:p>
+            <w:pPr>
+              <w:rPr>
+                <w:rFonts w:ascii="Times New Roman" w:hAnsi="Times New Roman" w:cs="Times New Roman"/>
+                <w:b/>
+                <w:bCs/>
+              </w:rPr>
+            </w:pPr>
+          </w:p>
+        </w:tc>
+        <w:tc>
+          <w:tcPr>
+            <w:tcW w:w="3117" w:type="dxa"/>
+          </w:tcPr>
+          <w:p>
+            <w:pPr>
+              <w:rPr>
+                <w:rFonts w:ascii="Times New Roman" w:hAnsi="Times New Roman" w:cs="Times New Roman"/>
+              </w:rPr>
+            </w:pPr>
+            <w:proofErr w:type="spellStart"/>
+            <w:r>
+              <w:rPr>
+                <w:rFonts w:ascii="Times New Roman" w:hAnsi="Times New Roman" w:cs="Times New Roman"/>
+              </w:rPr>
+              <w:t>Mplus</w:t>
+            </w:r>
+            <w:proofErr w:type="spellEnd"/>
+            <w:r>
+              <w:rPr>
+                <w:rFonts w:ascii="Times New Roman" w:hAnsi="Times New Roman" w:cs="Times New Roman"/>
+              </w:rPr>
+              <w:t xml:space="preserve"> Output</w:t>
+            </w:r>
+          </w:p>
+        </w:tc>
+        <w:tc>
+          <w:tcPr>
+            <w:tcW w:w="3117" w:type="dxa"/>
+          </w:tcPr>
+          <w:p>
+            <w:pPr>
+              <w:rPr>
+                <w:rFonts w:ascii="Times New Roman" w:hAnsi="Times New Roman" w:cs="Times New Roman"/>
+              </w:rPr>
+            </w:pPr>
+            <w:r>
+              <w:rPr>
+                <w:rFonts w:ascii="Times New Roman" w:hAnsi="Times New Roman" w:cs="Times New Roman"/>
+              </w:rPr>
+              <w:t>TXT and HTML outputs of BCH outcomes for both E-Cig and Smokeless.</w:t>
+            </w:r>
           </w:p>
         </w:tc>
       </w:tr>

</xml_diff>